<commit_message>
Tài liệu: nhận xét của Haan cho SAD và SDD, ADR-006→010, báo cáo hạng mục chưa hoàn thành
- SAD: container số hoá ở mục triển khai; AI Design là phụ trợ tuỳ chọn, quy tắc suy giảm
  và trần chi tiêu; mục 10 theo môi trường đã tách; TBD-9→11; ADR-006→010 có tệp riêng.
- SDD: nhật ký để điều tra sự cố (5.4); dải AI Design theo mã hiện tại (bỏ bước chương
  trình không gian); quy trình số hoá hồ sơ cũ (8.7); khi nhánh AI không dùng được (8.8).
- Báo cáo đối chiếu SAD/SDD với mã: 11 mục chờ NVG, 9 mục đã thiết kế chưa dựng, 6 mục
  triển khai — C-1 và TBD-2 đã xong.

Co-Authored-By: Claude Opus 5.5 <noreply@anthropic.com>
</commit_message>
<xml_diff>
--- a/doc/architecture/SAD.docx
+++ b/doc/architecture/SAD.docx
@@ -2104,9 +2104,9 @@
         </w:tblBorders>
       </w:tblPr>
       <w:tblGrid>
-        <w:gridCol w:w="2618"/>
-        <w:gridCol w:w="3301"/>
-        <w:gridCol w:w="3719"/>
+        <w:gridCol w:w="2642"/>
+        <w:gridCol w:w="3257"/>
+        <w:gridCol w:w="3739"/>
       </w:tblGrid>
       <w:tr>
         <w:trPr>
@@ -2114,7 +2114,7 @@
         </w:trPr>
         <w:tc>
           <w:tcPr>
-            <w:tcW w:type="dxa" w:w="2618"/>
+            <w:tcW w:type="dxa" w:w="2642"/>
             <w:shd w:fill="EAF1EE" w:color="auto" w:val="clear"/>
             <w:tcMar>
               <w:top w:type="dxa" w:w="60"/>
@@ -2144,7 +2144,7 @@
         </w:tc>
         <w:tc>
           <w:tcPr>
-            <w:tcW w:type="dxa" w:w="3301"/>
+            <w:tcW w:type="dxa" w:w="3257"/>
             <w:shd w:fill="EAF1EE" w:color="auto" w:val="clear"/>
             <w:tcMar>
               <w:top w:type="dxa" w:w="60"/>
@@ -2174,7 +2174,7 @@
         </w:tc>
         <w:tc>
           <w:tcPr>
-            <w:tcW w:type="dxa" w:w="3719"/>
+            <w:tcW w:type="dxa" w:w="3739"/>
             <w:shd w:fill="EAF1EE" w:color="auto" w:val="clear"/>
             <w:tcMar>
               <w:top w:type="dxa" w:w="60"/>
@@ -2209,7 +2209,7 @@
         </w:trPr>
         <w:tc>
           <w:tcPr>
-            <w:tcW w:type="dxa" w:w="2618"/>
+            <w:tcW w:type="dxa" w:w="2642"/>
             <w:tcMar>
               <w:top w:type="dxa" w:w="60"/>
               <w:left w:type="dxa" w:w="90"/>
@@ -2238,7 +2238,7 @@
         </w:tc>
         <w:tc>
           <w:tcPr>
-            <w:tcW w:type="dxa" w:w="3301"/>
+            <w:tcW w:type="dxa" w:w="3257"/>
             <w:tcMar>
               <w:top w:type="dxa" w:w="60"/>
               <w:left w:type="dxa" w:w="90"/>
@@ -2267,7 +2267,7 @@
         </w:tc>
         <w:tc>
           <w:tcPr>
-            <w:tcW w:type="dxa" w:w="3719"/>
+            <w:tcW w:type="dxa" w:w="3739"/>
             <w:tcMar>
               <w:top w:type="dxa" w:w="60"/>
               <w:left w:type="dxa" w:w="90"/>
@@ -2301,7 +2301,7 @@
         </w:trPr>
         <w:tc>
           <w:tcPr>
-            <w:tcW w:type="dxa" w:w="2618"/>
+            <w:tcW w:type="dxa" w:w="2642"/>
             <w:tcMar>
               <w:top w:type="dxa" w:w="60"/>
               <w:left w:type="dxa" w:w="90"/>
@@ -2330,7 +2330,7 @@
         </w:tc>
         <w:tc>
           <w:tcPr>
-            <w:tcW w:type="dxa" w:w="3301"/>
+            <w:tcW w:type="dxa" w:w="3257"/>
             <w:tcMar>
               <w:top w:type="dxa" w:w="60"/>
               <w:left w:type="dxa" w:w="90"/>
@@ -2359,7 +2359,7 @@
         </w:tc>
         <w:tc>
           <w:tcPr>
-            <w:tcW w:type="dxa" w:w="3719"/>
+            <w:tcW w:type="dxa" w:w="3739"/>
             <w:tcMar>
               <w:top w:type="dxa" w:w="60"/>
               <w:left w:type="dxa" w:w="90"/>
@@ -2393,7 +2393,7 @@
         </w:trPr>
         <w:tc>
           <w:tcPr>
-            <w:tcW w:type="dxa" w:w="2618"/>
+            <w:tcW w:type="dxa" w:w="2642"/>
             <w:tcMar>
               <w:top w:type="dxa" w:w="60"/>
               <w:left w:type="dxa" w:w="90"/>
@@ -2422,7 +2422,7 @@
         </w:tc>
         <w:tc>
           <w:tcPr>
-            <w:tcW w:type="dxa" w:w="3301"/>
+            <w:tcW w:type="dxa" w:w="3257"/>
             <w:tcMar>
               <w:top w:type="dxa" w:w="60"/>
               <w:left w:type="dxa" w:w="90"/>
@@ -2451,7 +2451,7 @@
         </w:tc>
         <w:tc>
           <w:tcPr>
-            <w:tcW w:type="dxa" w:w="3719"/>
+            <w:tcW w:type="dxa" w:w="3739"/>
             <w:tcMar>
               <w:top w:type="dxa" w:w="60"/>
               <w:left w:type="dxa" w:w="90"/>
@@ -2485,7 +2485,7 @@
         </w:trPr>
         <w:tc>
           <w:tcPr>
-            <w:tcW w:type="dxa" w:w="2618"/>
+            <w:tcW w:type="dxa" w:w="2642"/>
             <w:tcMar>
               <w:top w:type="dxa" w:w="60"/>
               <w:left w:type="dxa" w:w="90"/>
@@ -2514,7 +2514,7 @@
         </w:tc>
         <w:tc>
           <w:tcPr>
-            <w:tcW w:type="dxa" w:w="3301"/>
+            <w:tcW w:type="dxa" w:w="3257"/>
             <w:tcMar>
               <w:top w:type="dxa" w:w="60"/>
               <w:left w:type="dxa" w:w="90"/>
@@ -2543,7 +2543,7 @@
         </w:tc>
         <w:tc>
           <w:tcPr>
-            <w:tcW w:type="dxa" w:w="3719"/>
+            <w:tcW w:type="dxa" w:w="3739"/>
             <w:tcMar>
               <w:top w:type="dxa" w:w="60"/>
               <w:left w:type="dxa" w:w="90"/>
@@ -2577,7 +2577,7 @@
         </w:trPr>
         <w:tc>
           <w:tcPr>
-            <w:tcW w:type="dxa" w:w="2618"/>
+            <w:tcW w:type="dxa" w:w="2642"/>
             <w:tcMar>
               <w:top w:type="dxa" w:w="60"/>
               <w:left w:type="dxa" w:w="90"/>
@@ -2606,7 +2606,7 @@
         </w:tc>
         <w:tc>
           <w:tcPr>
-            <w:tcW w:type="dxa" w:w="3301"/>
+            <w:tcW w:type="dxa" w:w="3257"/>
             <w:tcMar>
               <w:top w:type="dxa" w:w="60"/>
               <w:left w:type="dxa" w:w="90"/>
@@ -2635,7 +2635,7 @@
         </w:tc>
         <w:tc>
           <w:tcPr>
-            <w:tcW w:type="dxa" w:w="3719"/>
+            <w:tcW w:type="dxa" w:w="3739"/>
             <w:tcMar>
               <w:top w:type="dxa" w:w="60"/>
               <w:left w:type="dxa" w:w="90"/>
@@ -2669,7 +2669,7 @@
         </w:trPr>
         <w:tc>
           <w:tcPr>
-            <w:tcW w:type="dxa" w:w="2618"/>
+            <w:tcW w:type="dxa" w:w="2642"/>
             <w:tcMar>
               <w:top w:type="dxa" w:w="60"/>
               <w:left w:type="dxa" w:w="90"/>
@@ -2698,7 +2698,7 @@
         </w:tc>
         <w:tc>
           <w:tcPr>
-            <w:tcW w:type="dxa" w:w="3301"/>
+            <w:tcW w:type="dxa" w:w="3257"/>
             <w:tcMar>
               <w:top w:type="dxa" w:w="60"/>
               <w:left w:type="dxa" w:w="90"/>
@@ -2727,7 +2727,7 @@
         </w:tc>
         <w:tc>
           <w:tcPr>
-            <w:tcW w:type="dxa" w:w="3719"/>
+            <w:tcW w:type="dxa" w:w="3739"/>
             <w:tcMar>
               <w:top w:type="dxa" w:w="60"/>
               <w:left w:type="dxa" w:w="90"/>
@@ -2761,7 +2761,7 @@
         </w:trPr>
         <w:tc>
           <w:tcPr>
-            <w:tcW w:type="dxa" w:w="2618"/>
+            <w:tcW w:type="dxa" w:w="2642"/>
             <w:tcMar>
               <w:top w:type="dxa" w:w="60"/>
               <w:left w:type="dxa" w:w="90"/>
@@ -2790,7 +2790,7 @@
         </w:tc>
         <w:tc>
           <w:tcPr>
-            <w:tcW w:type="dxa" w:w="3301"/>
+            <w:tcW w:type="dxa" w:w="3257"/>
             <w:tcMar>
               <w:top w:type="dxa" w:w="60"/>
               <w:left w:type="dxa" w:w="90"/>
@@ -2819,7 +2819,7 @@
         </w:tc>
         <w:tc>
           <w:tcPr>
-            <w:tcW w:type="dxa" w:w="3719"/>
+            <w:tcW w:type="dxa" w:w="3739"/>
             <w:tcMar>
               <w:top w:type="dxa" w:w="60"/>
               <w:left w:type="dxa" w:w="90"/>
@@ -2843,6 +2843,111 @@
                 <w:szCs w:val="19"/>
               </w:rPr>
               <w:t xml:space="preserve">Cấm dùng điều khiển gốc tự sinh chữ; có kiểm thử canh</w:t>
+            </w:r>
+          </w:p>
+        </w:tc>
+      </w:tr>
+      <w:tr>
+        <w:trPr>
+          <w:cantSplit/>
+        </w:trPr>
+        <w:tc>
+          <w:tcPr>
+            <w:tcW w:type="dxa" w:w="2642"/>
+            <w:tcMar>
+              <w:top w:type="dxa" w:w="60"/>
+              <w:left w:type="dxa" w:w="90"/>
+              <w:bottom w:type="dxa" w:w="60"/>
+              <w:right w:type="dxa" w:w="90"/>
+            </w:tcMar>
+          </w:tcPr>
+          <w:p>
+            <w:pPr>
+              <w:spacing w:after="0" w:line="252"/>
+            </w:pPr>
+            <w:r>
+              <w:rPr>
+                <w:rFonts w:ascii="Calibri" w:cs="Calibri" w:eastAsia="Calibri" w:hAnsi="Calibri"/>
+                <w:b w:val="false"/>
+                <w:bCs w:val="false"/>
+                <w:i w:val="false"/>
+                <w:iCs w:val="false"/>
+                <w:color w:val="1F2933"/>
+                <w:sz w:val="19"/>
+                <w:szCs w:val="19"/>
+              </w:rPr>
+              <w:t xml:space="preserve">AI là dịch vụ ngoài, có thể sập hoặc quá đắt</w:t>
+            </w:r>
+          </w:p>
+        </w:tc>
+        <w:tc>
+          <w:tcPr>
+            <w:tcW w:type="dxa" w:w="3257"/>
+            <w:tcMar>
+              <w:top w:type="dxa" w:w="60"/>
+              <w:left w:type="dxa" w:w="90"/>
+              <w:bottom w:type="dxa" w:w="60"/>
+              <w:right w:type="dxa" w:w="90"/>
+            </w:tcMar>
+          </w:tcPr>
+          <w:p>
+            <w:pPr>
+              <w:spacing w:after="0" w:line="252"/>
+            </w:pPr>
+            <w:r>
+              <w:rPr>
+                <w:rFonts w:ascii="Calibri" w:cs="Calibri" w:eastAsia="Calibri" w:hAnsi="Calibri"/>
+                <w:b w:val="false"/>
+                <w:bCs w:val="false"/>
+                <w:i w:val="false"/>
+                <w:iCs w:val="false"/>
+                <w:color w:val="1F2933"/>
+                <w:sz w:val="19"/>
+                <w:szCs w:val="19"/>
+              </w:rPr>
+              <w:t xml:space="preserve">Phòng Thiết kế làm trọn việc của mình khi </w:t>
+            </w:r>
+            <w:r>
+              <w:rPr>
+                <w:rFonts w:ascii="Calibri" w:cs="Calibri" w:eastAsia="Calibri" w:hAnsi="Calibri"/>
+                <w:b/>
+                <w:bCs/>
+                <w:i w:val="false"/>
+                <w:iCs w:val="false"/>
+                <w:color w:val="1F2933"/>
+                <w:sz w:val="19"/>
+                <w:szCs w:val="19"/>
+              </w:rPr>
+              <w:t xml:space="preserve">không có AI</w:t>
+            </w:r>
+          </w:p>
+        </w:tc>
+        <w:tc>
+          <w:tcPr>
+            <w:tcW w:type="dxa" w:w="3739"/>
+            <w:tcMar>
+              <w:top w:type="dxa" w:w="60"/>
+              <w:left w:type="dxa" w:w="90"/>
+              <w:bottom w:type="dxa" w:w="60"/>
+              <w:right w:type="dxa" w:w="90"/>
+            </w:tcMar>
+          </w:tcPr>
+          <w:p>
+            <w:pPr>
+              <w:spacing w:after="0" w:line="252"/>
+            </w:pPr>
+            <w:r>
+              <w:rPr>
+                <w:rFonts w:ascii="Calibri" w:cs="Calibri" w:eastAsia="Calibri" w:hAnsi="Calibri"/>
+                <w:b w:val="false"/>
+                <w:bCs w:val="false"/>
+                <w:i w:val="false"/>
+                <w:iCs w:val="false"/>
+                <w:color w:val="1F2933"/>
+                <w:sz w:val="19"/>
+                <w:szCs w:val="19"/>
+              </w:rPr>
+              <w:t xml:space="preserve">Nhánh AI tách rời, không nằm trên đường chạy nào của luồng thiết kế thủ công — xem mục 11</w:t>
             </w:r>
           </w:p>
         </w:tc>
@@ -5128,7 +5233,7 @@
           <w:sz w:val="21"/>
           <w:szCs w:val="21"/>
         </w:rPr>
-        <w:t xml:space="preserve">Hai ranh giới cứng: </w:t>
+        <w:t xml:space="preserve">Ba ranh giới cứng: </w:t>
       </w:r>
       <w:r>
         <w:rPr>
@@ -5154,7 +5259,7 @@
           <w:sz w:val="21"/>
           <w:szCs w:val="21"/>
         </w:rPr>
-        <w:t xml:space="preserve"> (một nguồn dữ liệu duy nhất, báo cáo đọc từ nơi phát sinh), và </w:t>
+        <w:t xml:space="preserve"> (một nguồn dữ liệu duy nhất, báo cáo đọc từ nơi phát sinh) · </w:t>
       </w:r>
       <w:r>
         <w:rPr>
@@ -5180,7 +5285,33 @@
           <w:sz w:val="21"/>
           <w:szCs w:val="21"/>
         </w:rPr>
-        <w:t xml:space="preserve"> (kết quả AI là đề xuất; người có thẩm quyền mới phát hành).</w:t>
+        <w:t xml:space="preserve"> (kết quả AI là đề xuất; người có thẩm quyền mới phát hành) · </w:t>
+      </w:r>
+      <w:r>
+        <w:rPr>
+          <w:rFonts w:ascii="Calibri" w:cs="Calibri" w:eastAsia="Calibri" w:hAnsi="Calibri"/>
+          <w:b/>
+          <w:bCs/>
+          <w:i w:val="false"/>
+          <w:iCs w:val="false"/>
+          <w:color w:val="1F2933"/>
+          <w:sz w:val="21"/>
+          <w:szCs w:val="21"/>
+        </w:rPr>
+        <w:t xml:space="preserve">Thiết kế AI là phụ trợ tuỳ chọn</w:t>
+      </w:r>
+      <w:r>
+        <w:rPr>
+          <w:rFonts w:ascii="Calibri" w:cs="Calibri" w:eastAsia="Calibri" w:hAnsi="Calibri"/>
+          <w:b w:val="false"/>
+          <w:bCs w:val="false"/>
+          <w:i w:val="false"/>
+          <w:iCs w:val="false"/>
+          <w:color w:val="1F2933"/>
+          <w:sz w:val="21"/>
+          <w:szCs w:val="21"/>
+        </w:rPr>
+        <w:t xml:space="preserve">, không phải một bước bắt buộc của luồng thiết kế (mục 11).</w:t>
       </w:r>
     </w:p>
     <w:p>
@@ -11074,10 +11205,10 @@
         </w:tblBorders>
       </w:tblPr>
       <w:tblGrid>
-        <w:gridCol w:w="2147"/>
-        <w:gridCol w:w="2932"/>
-        <w:gridCol w:w="2105"/>
-        <w:gridCol w:w="2454"/>
+        <w:gridCol w:w="1849"/>
+        <w:gridCol w:w="2526"/>
+        <w:gridCol w:w="1813"/>
+        <w:gridCol w:w="3450"/>
       </w:tblGrid>
       <w:tr>
         <w:trPr>
@@ -11085,7 +11216,7 @@
         </w:trPr>
         <w:tc>
           <w:tcPr>
-            <w:tcW w:type="dxa" w:w="2147"/>
+            <w:tcW w:type="dxa" w:w="1849"/>
             <w:shd w:fill="EAF1EE" w:color="auto" w:val="clear"/>
             <w:tcMar>
               <w:top w:type="dxa" w:w="60"/>
@@ -11115,7 +11246,7 @@
         </w:tc>
         <w:tc>
           <w:tcPr>
-            <w:tcW w:type="dxa" w:w="2932"/>
+            <w:tcW w:type="dxa" w:w="2526"/>
             <w:shd w:fill="EAF1EE" w:color="auto" w:val="clear"/>
             <w:tcMar>
               <w:top w:type="dxa" w:w="60"/>
@@ -11145,7 +11276,7 @@
         </w:tc>
         <w:tc>
           <w:tcPr>
-            <w:tcW w:type="dxa" w:w="2105"/>
+            <w:tcW w:type="dxa" w:w="1813"/>
             <w:shd w:fill="EAF1EE" w:color="auto" w:val="clear"/>
             <w:tcMar>
               <w:top w:type="dxa" w:w="60"/>
@@ -11175,7 +11306,7 @@
         </w:tc>
         <w:tc>
           <w:tcPr>
-            <w:tcW w:type="dxa" w:w="2454"/>
+            <w:tcW w:type="dxa" w:w="3450"/>
             <w:shd w:fill="EAF1EE" w:color="auto" w:val="clear"/>
             <w:tcMar>
               <w:top w:type="dxa" w:w="60"/>
@@ -11210,7 +11341,7 @@
         </w:trPr>
         <w:tc>
           <w:tcPr>
-            <w:tcW w:type="dxa" w:w="2147"/>
+            <w:tcW w:type="dxa" w:w="1849"/>
             <w:tcMar>
               <w:top w:type="dxa" w:w="60"/>
               <w:left w:type="dxa" w:w="90"/>
@@ -11239,7 +11370,7 @@
         </w:tc>
         <w:tc>
           <w:tcPr>
-            <w:tcW w:type="dxa" w:w="2932"/>
+            <w:tcW w:type="dxa" w:w="2526"/>
             <w:tcMar>
               <w:top w:type="dxa" w:w="60"/>
               <w:left w:type="dxa" w:w="90"/>
@@ -11268,7 +11399,7 @@
         </w:tc>
         <w:tc>
           <w:tcPr>
-            <w:tcW w:type="dxa" w:w="2105"/>
+            <w:tcW w:type="dxa" w:w="1813"/>
             <w:tcMar>
               <w:top w:type="dxa" w:w="60"/>
               <w:left w:type="dxa" w:w="90"/>
@@ -11297,30 +11428,56 @@
         </w:tc>
         <w:tc>
           <w:tcPr>
-            <w:tcW w:type="dxa" w:w="2454"/>
-            <w:tcMar>
-              <w:top w:type="dxa" w:w="60"/>
-              <w:left w:type="dxa" w:w="90"/>
-              <w:bottom w:type="dxa" w:w="60"/>
-              <w:right w:type="dxa" w:w="90"/>
-            </w:tcMar>
-          </w:tcPr>
-          <w:p>
-            <w:pPr>
-              <w:spacing w:after="0" w:line="252"/>
-            </w:pPr>
-            <w:r>
-              <w:rPr>
-                <w:rFonts w:ascii="Calibri" w:cs="Calibri" w:eastAsia="Calibri" w:hAnsi="Calibri"/>
-                <w:b w:val="false"/>
-                <w:bCs w:val="false"/>
-                <w:i w:val="false"/>
-                <w:iCs w:val="false"/>
-                <w:color w:val="1F2933"/>
-                <w:sz w:val="19"/>
-                <w:szCs w:val="19"/>
-              </w:rPr>
-              <w:t xml:space="preserve">Project riêng</w:t>
+            <w:tcW w:type="dxa" w:w="3450"/>
+            <w:tcMar>
+              <w:top w:type="dxa" w:w="60"/>
+              <w:left w:type="dxa" w:w="90"/>
+              <w:bottom w:type="dxa" w:w="60"/>
+              <w:right w:type="dxa" w:w="90"/>
+            </w:tcMar>
+          </w:tcPr>
+          <w:p>
+            <w:pPr>
+              <w:spacing w:after="0" w:line="252"/>
+            </w:pPr>
+            <w:r>
+              <w:rPr>
+                <w:rFonts w:ascii="Calibri" w:cs="Calibri" w:eastAsia="Calibri" w:hAnsi="Calibri"/>
+                <w:b w:val="false"/>
+                <w:bCs w:val="false"/>
+                <w:i w:val="false"/>
+                <w:iCs w:val="false"/>
+                <w:color w:val="1F2933"/>
+                <w:sz w:val="19"/>
+                <w:szCs w:val="19"/>
+              </w:rPr>
+              <w:t xml:space="preserve">Nền dữ liệu </w:t>
+            </w:r>
+            <w:r>
+              <w:rPr>
+                <w:rFonts w:ascii="Calibri" w:cs="Calibri" w:eastAsia="Calibri" w:hAnsi="Calibri"/>
+                <w:b/>
+                <w:bCs/>
+                <w:i w:val="false"/>
+                <w:iCs w:val="false"/>
+                <w:color w:val="1F2933"/>
+                <w:sz w:val="19"/>
+                <w:szCs w:val="19"/>
+              </w:rPr>
+              <w:t xml:space="preserve">chạy ngay trên máy trạm</w:t>
+            </w:r>
+            <w:r>
+              <w:rPr>
+                <w:rFonts w:ascii="Calibri" w:cs="Calibri" w:eastAsia="Calibri" w:hAnsi="Calibri"/>
+                <w:b w:val="false"/>
+                <w:bCs w:val="false"/>
+                <w:i w:val="false"/>
+                <w:iCs w:val="false"/>
+                <w:color w:val="1F2933"/>
+                <w:sz w:val="19"/>
+                <w:szCs w:val="19"/>
+              </w:rPr>
+              <w:t xml:space="preserve">, dựng từ migration</w:t>
             </w:r>
           </w:p>
         </w:tc>
@@ -11331,7 +11488,7 @@
         </w:trPr>
         <w:tc>
           <w:tcPr>
-            <w:tcW w:type="dxa" w:w="2147"/>
+            <w:tcW w:type="dxa" w:w="1849"/>
             <w:tcMar>
               <w:top w:type="dxa" w:w="60"/>
               <w:left w:type="dxa" w:w="90"/>
@@ -11360,7 +11517,7 @@
         </w:tc>
         <w:tc>
           <w:tcPr>
-            <w:tcW w:type="dxa" w:w="2932"/>
+            <w:tcW w:type="dxa" w:w="2526"/>
             <w:tcMar>
               <w:top w:type="dxa" w:w="60"/>
               <w:left w:type="dxa" w:w="90"/>
@@ -11389,7 +11546,7 @@
         </w:tc>
         <w:tc>
           <w:tcPr>
-            <w:tcW w:type="dxa" w:w="2105"/>
+            <w:tcW w:type="dxa" w:w="1813"/>
             <w:tcMar>
               <w:top w:type="dxa" w:w="60"/>
               <w:left w:type="dxa" w:w="90"/>
@@ -11418,30 +11575,30 @@
         </w:tc>
         <w:tc>
           <w:tcPr>
-            <w:tcW w:type="dxa" w:w="2454"/>
-            <w:tcMar>
-              <w:top w:type="dxa" w:w="60"/>
-              <w:left w:type="dxa" w:w="90"/>
-              <w:bottom w:type="dxa" w:w="60"/>
-              <w:right w:type="dxa" w:w="90"/>
-            </w:tcMar>
-          </w:tcPr>
-          <w:p>
-            <w:pPr>
-              <w:spacing w:after="0" w:line="252"/>
-            </w:pPr>
-            <w:r>
-              <w:rPr>
-                <w:rFonts w:ascii="Calibri" w:cs="Calibri" w:eastAsia="Calibri" w:hAnsi="Calibri"/>
-                <w:b w:val="false"/>
-                <w:bCs w:val="false"/>
-                <w:i w:val="false"/>
-                <w:iCs w:val="false"/>
-                <w:color w:val="1F2933"/>
-                <w:sz w:val="19"/>
-                <w:szCs w:val="19"/>
-              </w:rPr>
-              <w:t xml:space="preserve">Project riêng</w:t>
+            <w:tcW w:type="dxa" w:w="3450"/>
+            <w:tcMar>
+              <w:top w:type="dxa" w:w="60"/>
+              <w:left w:type="dxa" w:w="90"/>
+              <w:bottom w:type="dxa" w:w="60"/>
+              <w:right w:type="dxa" w:w="90"/>
+            </w:tcMar>
+          </w:tcPr>
+          <w:p>
+            <w:pPr>
+              <w:spacing w:after="0" w:line="252"/>
+            </w:pPr>
+            <w:r>
+              <w:rPr>
+                <w:rFonts w:ascii="Calibri" w:cs="Calibri" w:eastAsia="Calibri" w:hAnsi="Calibri"/>
+                <w:b w:val="false"/>
+                <w:bCs w:val="false"/>
+                <w:i w:val="false"/>
+                <w:iCs w:val="false"/>
+                <w:color w:val="1F2933"/>
+                <w:sz w:val="19"/>
+                <w:szCs w:val="19"/>
+              </w:rPr>
+              <w:t xml:space="preserve">Project cloud riêng — nơi trình diễn cho khách</w:t>
             </w:r>
           </w:p>
         </w:tc>
@@ -11452,7 +11609,7 @@
         </w:trPr>
         <w:tc>
           <w:tcPr>
-            <w:tcW w:type="dxa" w:w="2147"/>
+            <w:tcW w:type="dxa" w:w="1849"/>
             <w:tcMar>
               <w:top w:type="dxa" w:w="60"/>
               <w:left w:type="dxa" w:w="90"/>
@@ -11481,7 +11638,7 @@
         </w:tc>
         <w:tc>
           <w:tcPr>
-            <w:tcW w:type="dxa" w:w="2932"/>
+            <w:tcW w:type="dxa" w:w="2526"/>
             <w:tcMar>
               <w:top w:type="dxa" w:w="60"/>
               <w:left w:type="dxa" w:w="90"/>
@@ -11510,7 +11667,7 @@
         </w:tc>
         <w:tc>
           <w:tcPr>
-            <w:tcW w:type="dxa" w:w="2105"/>
+            <w:tcW w:type="dxa" w:w="1813"/>
             <w:tcMar>
               <w:top w:type="dxa" w:w="60"/>
               <w:left w:type="dxa" w:w="90"/>
@@ -11539,30 +11696,65 @@
         </w:tc>
         <w:tc>
           <w:tcPr>
-            <w:tcW w:type="dxa" w:w="2454"/>
-            <w:tcMar>
-              <w:top w:type="dxa" w:w="60"/>
-              <w:left w:type="dxa" w:w="90"/>
-              <w:bottom w:type="dxa" w:w="60"/>
-              <w:right w:type="dxa" w:w="90"/>
-            </w:tcMar>
-          </w:tcPr>
-          <w:p>
-            <w:pPr>
-              <w:spacing w:after="0" w:line="252"/>
-            </w:pPr>
-            <w:r>
-              <w:rPr>
-                <w:rFonts w:ascii="Calibri" w:cs="Calibri" w:eastAsia="Calibri" w:hAnsi="Calibri"/>
-                <w:b w:val="false"/>
-                <w:bCs w:val="false"/>
-                <w:i w:val="false"/>
-                <w:iCs w:val="false"/>
-                <w:color w:val="1F2933"/>
-                <w:sz w:val="19"/>
-                <w:szCs w:val="19"/>
-              </w:rPr>
-              <w:t xml:space="preserve">Project riêng</w:t>
+            <w:tcW w:type="dxa" w:w="3450"/>
+            <w:tcMar>
+              <w:top w:type="dxa" w:w="60"/>
+              <w:left w:type="dxa" w:w="90"/>
+              <w:bottom w:type="dxa" w:w="60"/>
+              <w:right w:type="dxa" w:w="90"/>
+            </w:tcMar>
+          </w:tcPr>
+          <w:p>
+            <w:pPr>
+              <w:spacing w:after="0" w:line="252"/>
+            </w:pPr>
+            <w:r>
+              <w:rPr>
+                <w:rFonts w:ascii="Calibri" w:cs="Calibri" w:eastAsia="Calibri" w:hAnsi="Calibri"/>
+                <w:b w:val="false"/>
+                <w:bCs w:val="false"/>
+                <w:i w:val="false"/>
+                <w:iCs w:val="false"/>
+                <w:color w:val="1F2933"/>
+                <w:sz w:val="19"/>
+                <w:szCs w:val="19"/>
+              </w:rPr>
+              <w:t xml:space="preserve">Project cloud riêng, </w:t>
+            </w:r>
+            <w:r>
+              <w:rPr>
+                <w:rFonts w:ascii="Calibri" w:cs="Calibri" w:eastAsia="Calibri" w:hAnsi="Calibri"/>
+                <w:b/>
+                <w:bCs/>
+                <w:i w:val="false"/>
+                <w:iCs w:val="false"/>
+                <w:color w:val="1F2933"/>
+                <w:sz w:val="19"/>
+                <w:szCs w:val="19"/>
+              </w:rPr>
+              <w:t xml:space="preserve">gói có sao lưu tự động</w:t>
+            </w:r>
+            <w:r>
+              <w:rPr>
+                <w:rFonts w:ascii="Calibri" w:cs="Calibri" w:eastAsia="Calibri" w:hAnsi="Calibri"/>
+                <w:b w:val="false"/>
+                <w:bCs w:val="false"/>
+                <w:i w:val="false"/>
+                <w:iCs w:val="false"/>
+                <w:color w:val="1F2933"/>
+                <w:sz w:val="19"/>
+                <w:szCs w:val="19"/>
+              </w:rPr>
+              <w:t xml:space="preserve"> — </w:t>
+            </w:r>
+            <w:r>
+              <w:rPr>
+                <w:rFonts w:ascii="Consolas" w:cs="Consolas" w:eastAsia="Consolas" w:hAnsi="Consolas"/>
+                <w:color w:val="1F2933"/>
+                <w:sz w:val="17"/>
+                <w:szCs w:val="17"/>
+              </w:rPr>
+              <w:t xml:space="preserve">TBD-11</w:t>
             </w:r>
           </w:p>
         </w:tc>
@@ -12032,7 +12224,7 @@
           <w:sz w:val="21"/>
           <w:szCs w:val="21"/>
         </w:rPr>
-        <w:t xml:space="preserve">Mỗi môi trường một project cơ sở dữ liệu riêng.</w:t>
+        <w:t xml:space="preserve">Mỗi môi trường một cơ sở dữ liệu riêng.</w:t>
       </w:r>
       <w:r>
         <w:rPr>
@@ -12045,7 +12237,59 @@
           <w:sz w:val="21"/>
           <w:szCs w:val="21"/>
         </w:rPr>
-        <w:t xml:space="preserve"> Dùng chung một project giữa phát triển và chạy thử là không chấp nhận được: lệnh cập nhật cấu trúc ở máy sẽ đổi luôn dữ liệu bản công khai, và kiểm thử có thể xoá dữ liệu thật.</w:t>
+        <w:t xml:space="preserve"> Dùng chung giữa phát triển và chạy thử là không chấp nhận được: lệnh cập nhật cấu trúc ở máy sẽ đổi luôn dữ liệu bản công khai, và kiểm thử có thể xoá dữ liệu thật. - </w:t>
+      </w:r>
+      <w:r>
+        <w:rPr>
+          <w:rFonts w:ascii="Calibri" w:cs="Calibri" w:eastAsia="Calibri" w:hAnsi="Calibri"/>
+          <w:b/>
+          <w:bCs/>
+          <w:i w:val="false"/>
+          <w:iCs w:val="false"/>
+          <w:color w:val="1F2933"/>
+          <w:sz w:val="21"/>
+          <w:szCs w:val="21"/>
+        </w:rPr>
+        <w:t xml:space="preserve">Bộ kiểm thử chỉ chạy trên môi trường phát triển</w:t>
+      </w:r>
+      <w:r>
+        <w:rPr>
+          <w:rFonts w:ascii="Calibri" w:cs="Calibri" w:eastAsia="Calibri" w:hAnsi="Calibri"/>
+          <w:b w:val="false"/>
+          <w:bCs w:val="false"/>
+          <w:i w:val="false"/>
+          <w:iCs w:val="false"/>
+          <w:color w:val="1F2933"/>
+          <w:sz w:val="21"/>
+          <w:szCs w:val="21"/>
+        </w:rPr>
+        <w:t xml:space="preserve">, và điều đó được cưỡng chế bằng mã: kiểm thử trỏ vào môi trường khác thì dừng trước khi mở kết nối, kể cả khi được gọi tường minh. - Cập nhật cấu trúc lên môi trường khác chỉ bằng một lệnh riêng, gọi tường minh lúc phát hành. - </w:t>
+      </w:r>
+      <w:r>
+        <w:rPr>
+          <w:rFonts w:ascii="Calibri" w:cs="Calibri" w:eastAsia="Calibri" w:hAnsi="Calibri"/>
+          <w:b/>
+          <w:bCs/>
+          <w:i w:val="false"/>
+          <w:iCs w:val="false"/>
+          <w:color w:val="1F2933"/>
+          <w:sz w:val="21"/>
+          <w:szCs w:val="21"/>
+        </w:rPr>
+        <w:t xml:space="preserve">Mọi thứ trên nền dữ liệu phải dựng lại được từ mã nguồn</w:t>
+      </w:r>
+      <w:r>
+        <w:rPr>
+          <w:rFonts w:ascii="Calibri" w:cs="Calibri" w:eastAsia="Calibri" w:hAnsi="Calibri"/>
+          <w:b w:val="false"/>
+          <w:bCs w:val="false"/>
+          <w:i w:val="false"/>
+          <w:iCs w:val="false"/>
+          <w:color w:val="1F2933"/>
+          <w:sz w:val="21"/>
+          <w:szCs w:val="21"/>
+        </w:rPr>
+        <w:t xml:space="preserve">: cấu trúc bảng, kho tệp, cơ chế tự bật phân quyền, danh mục vai trò. Thứ tạo tay trên bảng điều khiển là thứ môi trường mới sẽ thiếu mà không ai biết.</w:t>
       </w:r>
     </w:p>
     <w:p>
@@ -13066,6 +13310,1457 @@
     </w:p>
     <w:p>
       <w:pPr>
+        <w:spacing w:after="140" w:line="276"/>
+        <w:jc w:val="left"/>
+      </w:pPr>
+      <w:r>
+        <w:rPr>
+          <w:rFonts w:ascii="Calibri" w:cs="Calibri" w:eastAsia="Calibri" w:hAnsi="Calibri"/>
+          <w:b/>
+          <w:bCs/>
+          <w:i w:val="false"/>
+          <w:iCs w:val="false"/>
+          <w:color w:val="1F2933"/>
+          <w:sz w:val="21"/>
+          <w:szCs w:val="21"/>
+        </w:rPr>
+        <w:t xml:space="preserve">Thiết kế AI là phụ trợ tuỳ chọn — quy tắc suy giảm</w:t>
+      </w:r>
+    </w:p>
+    <w:p>
+      <w:pPr>
+        <w:spacing w:after="140" w:line="276"/>
+        <w:jc w:val="left"/>
+      </w:pPr>
+      <w:r>
+        <w:rPr>
+          <w:rFonts w:ascii="Calibri" w:cs="Calibri" w:eastAsia="Calibri" w:hAnsi="Calibri"/>
+          <w:b w:val="false"/>
+          <w:bCs w:val="false"/>
+          <w:i w:val="false"/>
+          <w:iCs w:val="false"/>
+          <w:color w:val="1F2933"/>
+          <w:sz w:val="21"/>
+          <w:szCs w:val="21"/>
+        </w:rPr>
+        <w:t xml:space="preserve">Phòng Thiết kế phải làm trọn được việc của mình khi nhánh AI không dùng được, vì bất kỳ lý do nào: nhà cung cấp mô hình ngừng phục vụ, hết hạn mức, chi phí vượt mức chi trả, hoặc chủ đầu tư quyết định tạm tắt. Đây là </w:t>
+      </w:r>
+      <w:r>
+        <w:rPr>
+          <w:rFonts w:ascii="Calibri" w:cs="Calibri" w:eastAsia="Calibri" w:hAnsi="Calibri"/>
+          <w:b/>
+          <w:bCs/>
+          <w:i w:val="false"/>
+          <w:iCs w:val="false"/>
+          <w:color w:val="1F2933"/>
+          <w:sz w:val="21"/>
+          <w:szCs w:val="21"/>
+        </w:rPr>
+        <w:t xml:space="preserve">yêu cầu của chủ đầu tư</w:t>
+      </w:r>
+      <w:r>
+        <w:rPr>
+          <w:rFonts w:ascii="Calibri" w:cs="Calibri" w:eastAsia="Calibri" w:hAnsi="Calibri"/>
+          <w:b w:val="false"/>
+          <w:bCs w:val="false"/>
+          <w:i w:val="false"/>
+          <w:iCs w:val="false"/>
+          <w:color w:val="1F2933"/>
+          <w:sz w:val="21"/>
+          <w:szCs w:val="21"/>
+        </w:rPr>
+        <w:t xml:space="preserve">, không phải suy luận kỹ thuật.</w:t>
+      </w:r>
+    </w:p>
+    <w:p>
+      <w:pPr>
+        <w:spacing w:after="140" w:line="276"/>
+        <w:jc w:val="left"/>
+      </w:pPr>
+      <w:r>
+        <w:rPr>
+          <w:rFonts w:ascii="Calibri" w:cs="Calibri" w:eastAsia="Calibri" w:hAnsi="Calibri"/>
+          <w:b w:val="false"/>
+          <w:bCs w:val="false"/>
+          <w:i w:val="false"/>
+          <w:iCs w:val="false"/>
+          <w:color w:val="1F2933"/>
+          <w:sz w:val="21"/>
+          <w:szCs w:val="21"/>
+        </w:rPr>
+        <w:t xml:space="preserve">Luồng thiết kế thủ công gồm: hồ sơ dự án thiết kế · đầu bài · khảo sát hiện trạng kèm ảnh · tiến độ ba bộ môn · </w:t>
+      </w:r>
+      <w:r>
+        <w:rPr>
+          <w:rFonts w:ascii="Calibri" w:cs="Calibri" w:eastAsia="Calibri" w:hAnsi="Calibri"/>
+          <w:b/>
+          <w:bCs/>
+          <w:i w:val="false"/>
+          <w:iCs w:val="false"/>
+          <w:color w:val="1F2933"/>
+          <w:sz w:val="21"/>
+          <w:szCs w:val="21"/>
+        </w:rPr>
+        <w:t xml:space="preserve">phiên bản bản vẽ do kiến trúc sư tự làm rồi tải lên</w:t>
+      </w:r>
+      <w:r>
+        <w:rPr>
+          <w:rFonts w:ascii="Calibri" w:cs="Calibri" w:eastAsia="Calibri" w:hAnsi="Calibri"/>
+          <w:b w:val="false"/>
+          <w:bCs w:val="false"/>
+          <w:i w:val="false"/>
+          <w:iCs w:val="false"/>
+          <w:color w:val="1F2933"/>
+          <w:sz w:val="21"/>
+          <w:szCs w:val="21"/>
+        </w:rPr>
+        <w:t xml:space="preserve"> · dự toán · yêu cầu thay đổi · bàn giao thi công. Cả chuỗi này đọc ghi thẳng nền dữ liệu, </w:t>
+      </w:r>
+      <w:r>
+        <w:rPr>
+          <w:rFonts w:ascii="Calibri" w:cs="Calibri" w:eastAsia="Calibri" w:hAnsi="Calibri"/>
+          <w:b/>
+          <w:bCs/>
+          <w:i w:val="false"/>
+          <w:iCs w:val="false"/>
+          <w:color w:val="1F2933"/>
+          <w:sz w:val="21"/>
+          <w:szCs w:val="21"/>
+        </w:rPr>
+        <w:t xml:space="preserve">không gọi mô hình nào</w:t>
+      </w:r>
+      <w:r>
+        <w:rPr>
+          <w:rFonts w:ascii="Calibri" w:cs="Calibri" w:eastAsia="Calibri" w:hAnsi="Calibri"/>
+          <w:b w:val="false"/>
+          <w:bCs w:val="false"/>
+          <w:i w:val="false"/>
+          <w:iCs w:val="false"/>
+          <w:color w:val="1F2933"/>
+          <w:sz w:val="21"/>
+          <w:szCs w:val="21"/>
+        </w:rPr>
+        <w:t xml:space="preserve">.</w:t>
+      </w:r>
+    </w:p>
+    <w:tbl>
+      <w:tblPr>
+        <w:tblW w:type="dxa" w:w="9638"/>
+        <w:tblBorders>
+          <w:top w:val="single" w:color="C9D2CE" w:sz="4"/>
+          <w:left w:val="single" w:color="C9D2CE" w:sz="4"/>
+          <w:bottom w:val="single" w:color="C9D2CE" w:sz="4"/>
+          <w:right w:val="single" w:color="C9D2CE" w:sz="4"/>
+          <w:insideH w:val="single" w:color="C9D2CE" w:sz="4"/>
+          <w:insideV w:val="single" w:color="C9D2CE" w:sz="4"/>
+        </w:tblBorders>
+      </w:tblPr>
+      <w:tblGrid>
+        <w:gridCol w:w="2934"/>
+        <w:gridCol w:w="3273"/>
+        <w:gridCol w:w="3431"/>
+      </w:tblGrid>
+      <w:tr>
+        <w:trPr>
+          <w:tblHeader/>
+        </w:trPr>
+        <w:tc>
+          <w:tcPr>
+            <w:tcW w:type="dxa" w:w="2934"/>
+            <w:shd w:fill="EAF1EE" w:color="auto" w:val="clear"/>
+            <w:tcMar>
+              <w:top w:type="dxa" w:w="60"/>
+              <w:left w:type="dxa" w:w="90"/>
+              <w:bottom w:type="dxa" w:w="60"/>
+              <w:right w:type="dxa" w:w="90"/>
+            </w:tcMar>
+          </w:tcPr>
+          <w:p>
+            <w:pPr>
+              <w:spacing w:after="0" w:line="252"/>
+            </w:pPr>
+            <w:r>
+              <w:rPr>
+                <w:rFonts w:ascii="Calibri" w:cs="Calibri" w:eastAsia="Calibri" w:hAnsi="Calibri"/>
+                <w:b/>
+                <w:bCs/>
+                <w:i w:val="false"/>
+                <w:iCs w:val="false"/>
+                <w:color w:val="1F2933"/>
+                <w:sz w:val="19"/>
+                <w:szCs w:val="19"/>
+              </w:rPr>
+              <w:t xml:space="preserve">Hỏng cái gì</w:t>
+            </w:r>
+          </w:p>
+        </w:tc>
+        <w:tc>
+          <w:tcPr>
+            <w:tcW w:type="dxa" w:w="3273"/>
+            <w:shd w:fill="EAF1EE" w:color="auto" w:val="clear"/>
+            <w:tcMar>
+              <w:top w:type="dxa" w:w="60"/>
+              <w:left w:type="dxa" w:w="90"/>
+              <w:bottom w:type="dxa" w:w="60"/>
+              <w:right w:type="dxa" w:w="90"/>
+            </w:tcMar>
+          </w:tcPr>
+          <w:p>
+            <w:pPr>
+              <w:spacing w:after="0" w:line="252"/>
+            </w:pPr>
+            <w:r>
+              <w:rPr>
+                <w:rFonts w:ascii="Calibri" w:cs="Calibri" w:eastAsia="Calibri" w:hAnsi="Calibri"/>
+                <w:b/>
+                <w:bCs/>
+                <w:i w:val="false"/>
+                <w:iCs w:val="false"/>
+                <w:color w:val="1F2933"/>
+                <w:sz w:val="19"/>
+                <w:szCs w:val="19"/>
+              </w:rPr>
+              <w:t xml:space="preserve">Việc mất</w:t>
+            </w:r>
+          </w:p>
+        </w:tc>
+        <w:tc>
+          <w:tcPr>
+            <w:tcW w:type="dxa" w:w="3431"/>
+            <w:shd w:fill="EAF1EE" w:color="auto" w:val="clear"/>
+            <w:tcMar>
+              <w:top w:type="dxa" w:w="60"/>
+              <w:left w:type="dxa" w:w="90"/>
+              <w:bottom w:type="dxa" w:w="60"/>
+              <w:right w:type="dxa" w:w="90"/>
+            </w:tcMar>
+          </w:tcPr>
+          <w:p>
+            <w:pPr>
+              <w:spacing w:after="0" w:line="252"/>
+            </w:pPr>
+            <w:r>
+              <w:rPr>
+                <w:rFonts w:ascii="Calibri" w:cs="Calibri" w:eastAsia="Calibri" w:hAnsi="Calibri"/>
+                <w:b/>
+                <w:bCs/>
+                <w:i w:val="false"/>
+                <w:iCs w:val="false"/>
+                <w:color w:val="1F2933"/>
+                <w:sz w:val="19"/>
+                <w:szCs w:val="19"/>
+              </w:rPr>
+              <w:t xml:space="preserve">Việc vẫn chạy</w:t>
+            </w:r>
+          </w:p>
+        </w:tc>
+      </w:tr>
+      <w:tr>
+        <w:trPr>
+          <w:cantSplit/>
+        </w:trPr>
+        <w:tc>
+          <w:tcPr>
+            <w:tcW w:type="dxa" w:w="2934"/>
+            <w:tcMar>
+              <w:top w:type="dxa" w:w="60"/>
+              <w:left w:type="dxa" w:w="90"/>
+              <w:bottom w:type="dxa" w:w="60"/>
+              <w:right w:type="dxa" w:w="90"/>
+            </w:tcMar>
+          </w:tcPr>
+          <w:p>
+            <w:pPr>
+              <w:spacing w:after="0" w:line="252"/>
+            </w:pPr>
+            <w:r>
+              <w:rPr>
+                <w:rFonts w:ascii="Calibri" w:cs="Calibri" w:eastAsia="Calibri" w:hAnsi="Calibri"/>
+                <w:b w:val="false"/>
+                <w:bCs w:val="false"/>
+                <w:i w:val="false"/>
+                <w:iCs w:val="false"/>
+                <w:color w:val="1F2933"/>
+                <w:sz w:val="19"/>
+                <w:szCs w:val="19"/>
+              </w:rPr>
+              <w:t xml:space="preserve">Nhà cung cấp mô hình ngừng phục vụ, hết hạn mức, hoặc bị tắt vì chi phí</w:t>
+            </w:r>
+          </w:p>
+        </w:tc>
+        <w:tc>
+          <w:tcPr>
+            <w:tcW w:type="dxa" w:w="3273"/>
+            <w:tcMar>
+              <w:top w:type="dxa" w:w="60"/>
+              <w:left w:type="dxa" w:w="90"/>
+              <w:bottom w:type="dxa" w:w="60"/>
+              <w:right w:type="dxa" w:w="90"/>
+            </w:tcMar>
+          </w:tcPr>
+          <w:p>
+            <w:pPr>
+              <w:spacing w:after="0" w:line="252"/>
+            </w:pPr>
+            <w:r>
+              <w:rPr>
+                <w:rFonts w:ascii="Calibri" w:cs="Calibri" w:eastAsia="Calibri" w:hAnsi="Calibri"/>
+                <w:b w:val="false"/>
+                <w:bCs w:val="false"/>
+                <w:i w:val="false"/>
+                <w:iCs w:val="false"/>
+                <w:color w:val="1F2933"/>
+                <w:sz w:val="19"/>
+                <w:szCs w:val="19"/>
+              </w:rPr>
+              <w:t xml:space="preserve">Đề xuất mặt bằng, mặt đứng, phối cảnh; quy nhãn khi số hoá hồ sơ cũ</w:t>
+            </w:r>
+          </w:p>
+        </w:tc>
+        <w:tc>
+          <w:tcPr>
+            <w:tcW w:type="dxa" w:w="3431"/>
+            <w:tcMar>
+              <w:top w:type="dxa" w:w="60"/>
+              <w:left w:type="dxa" w:w="90"/>
+              <w:bottom w:type="dxa" w:w="60"/>
+              <w:right w:type="dxa" w:w="90"/>
+            </w:tcMar>
+          </w:tcPr>
+          <w:p>
+            <w:pPr>
+              <w:spacing w:after="0" w:line="252"/>
+            </w:pPr>
+            <w:r>
+              <w:rPr>
+                <w:rFonts w:ascii="Calibri" w:cs="Calibri" w:eastAsia="Calibri" w:hAnsi="Calibri"/>
+                <w:b/>
+                <w:bCs/>
+                <w:i w:val="false"/>
+                <w:iCs w:val="false"/>
+                <w:color w:val="1F2933"/>
+                <w:sz w:val="19"/>
+                <w:szCs w:val="19"/>
+              </w:rPr>
+              <w:t xml:space="preserve">Toàn bộ luồng thiết kế thủ công</w:t>
+            </w:r>
+            <w:r>
+              <w:rPr>
+                <w:rFonts w:ascii="Calibri" w:cs="Calibri" w:eastAsia="Calibri" w:hAnsi="Calibri"/>
+                <w:b w:val="false"/>
+                <w:bCs w:val="false"/>
+                <w:i w:val="false"/>
+                <w:iCs w:val="false"/>
+                <w:color w:val="1F2933"/>
+                <w:sz w:val="19"/>
+                <w:szCs w:val="19"/>
+              </w:rPr>
+              <w:t xml:space="preserve">, kể cả xác nhận đầu bài</w:t>
+            </w:r>
+          </w:p>
+        </w:tc>
+      </w:tr>
+      <w:tr>
+        <w:trPr>
+          <w:cantSplit/>
+        </w:trPr>
+        <w:tc>
+          <w:tcPr>
+            <w:tcW w:type="dxa" w:w="2934"/>
+            <w:tcMar>
+              <w:top w:type="dxa" w:w="60"/>
+              <w:left w:type="dxa" w:w="90"/>
+              <w:bottom w:type="dxa" w:w="60"/>
+              <w:right w:type="dxa" w:w="90"/>
+            </w:tcMar>
+          </w:tcPr>
+          <w:p>
+            <w:pPr>
+              <w:spacing w:after="0" w:line="252"/>
+            </w:pPr>
+            <w:r>
+              <w:rPr>
+                <w:rFonts w:ascii="Calibri" w:cs="Calibri" w:eastAsia="Calibri" w:hAnsi="Calibri"/>
+                <w:b w:val="false"/>
+                <w:bCs w:val="false"/>
+                <w:i w:val="false"/>
+                <w:iCs w:val="false"/>
+                <w:color w:val="1F2933"/>
+                <w:sz w:val="19"/>
+                <w:szCs w:val="19"/>
+              </w:rPr>
+              <w:t xml:space="preserve">Worker API hỏng</w:t>
+            </w:r>
+          </w:p>
+        </w:tc>
+        <w:tc>
+          <w:tcPr>
+            <w:tcW w:type="dxa" w:w="3273"/>
+            <w:tcMar>
+              <w:top w:type="dxa" w:w="60"/>
+              <w:left w:type="dxa" w:w="90"/>
+              <w:bottom w:type="dxa" w:w="60"/>
+              <w:right w:type="dxa" w:w="90"/>
+            </w:tcMar>
+          </w:tcPr>
+          <w:p>
+            <w:pPr>
+              <w:spacing w:after="0" w:line="252"/>
+            </w:pPr>
+            <w:r>
+              <w:rPr>
+                <w:rFonts w:ascii="Calibri" w:cs="Calibri" w:eastAsia="Calibri" w:hAnsi="Calibri"/>
+                <w:b w:val="false"/>
+                <w:bCs w:val="false"/>
+                <w:i w:val="false"/>
+                <w:iCs w:val="false"/>
+                <w:color w:val="1F2933"/>
+                <w:sz w:val="19"/>
+                <w:szCs w:val="19"/>
+              </w:rPr>
+              <w:t xml:space="preserve">Thêm: xác nhận đầu bài thành bản bất biến, và đọc lại kết quả AI cũ</w:t>
+            </w:r>
+          </w:p>
+        </w:tc>
+        <w:tc>
+          <w:tcPr>
+            <w:tcW w:type="dxa" w:w="3431"/>
+            <w:tcMar>
+              <w:top w:type="dxa" w:w="60"/>
+              <w:left w:type="dxa" w:w="90"/>
+              <w:bottom w:type="dxa" w:w="60"/>
+              <w:right w:type="dxa" w:w="90"/>
+            </w:tcMar>
+          </w:tcPr>
+          <w:p>
+            <w:pPr>
+              <w:spacing w:after="0" w:line="252"/>
+            </w:pPr>
+            <w:r>
+              <w:rPr>
+                <w:rFonts w:ascii="Calibri" w:cs="Calibri" w:eastAsia="Calibri" w:hAnsi="Calibri"/>
+                <w:b w:val="false"/>
+                <w:bCs w:val="false"/>
+                <w:i w:val="false"/>
+                <w:iCs w:val="false"/>
+                <w:color w:val="1F2933"/>
+                <w:sz w:val="19"/>
+                <w:szCs w:val="19"/>
+              </w:rPr>
+              <w:t xml:space="preserve">Nhập liệu, khảo sát, tải bản vẽ lên, dự toán, phê duyệt, và mọi module khác</w:t>
+            </w:r>
+          </w:p>
+        </w:tc>
+      </w:tr>
+      <w:tr>
+        <w:trPr>
+          <w:cantSplit/>
+        </w:trPr>
+        <w:tc>
+          <w:tcPr>
+            <w:tcW w:type="dxa" w:w="2934"/>
+            <w:tcMar>
+              <w:top w:type="dxa" w:w="60"/>
+              <w:left w:type="dxa" w:w="90"/>
+              <w:bottom w:type="dxa" w:w="60"/>
+              <w:right w:type="dxa" w:w="90"/>
+            </w:tcMar>
+          </w:tcPr>
+          <w:p>
+            <w:pPr>
+              <w:spacing w:after="0" w:line="252"/>
+            </w:pPr>
+            <w:r>
+              <w:rPr>
+                <w:rFonts w:ascii="Calibri" w:cs="Calibri" w:eastAsia="Calibri" w:hAnsi="Calibri"/>
+                <w:b w:val="false"/>
+                <w:bCs w:val="false"/>
+                <w:i w:val="false"/>
+                <w:iCs w:val="false"/>
+                <w:color w:val="1F2933"/>
+                <w:sz w:val="19"/>
+                <w:szCs w:val="19"/>
+              </w:rPr>
+              <w:t xml:space="preserve">Container số hoá không bật</w:t>
+            </w:r>
+          </w:p>
+        </w:tc>
+        <w:tc>
+          <w:tcPr>
+            <w:tcW w:type="dxa" w:w="3273"/>
+            <w:tcMar>
+              <w:top w:type="dxa" w:w="60"/>
+              <w:left w:type="dxa" w:w="90"/>
+              <w:bottom w:type="dxa" w:w="60"/>
+              <w:right w:type="dxa" w:w="90"/>
+            </w:tcMar>
+          </w:tcPr>
+          <w:p>
+            <w:pPr>
+              <w:spacing w:after="0" w:line="252"/>
+            </w:pPr>
+            <w:r>
+              <w:rPr>
+                <w:rFonts w:ascii="Calibri" w:cs="Calibri" w:eastAsia="Calibri" w:hAnsi="Calibri"/>
+                <w:b w:val="false"/>
+                <w:bCs w:val="false"/>
+                <w:i w:val="false"/>
+                <w:iCs w:val="false"/>
+                <w:color w:val="1F2933"/>
+                <w:sz w:val="19"/>
+                <w:szCs w:val="19"/>
+              </w:rPr>
+              <w:t xml:space="preserve">Số hoá hồ sơ cũ</w:t>
+            </w:r>
+          </w:p>
+        </w:tc>
+        <w:tc>
+          <w:tcPr>
+            <w:tcW w:type="dxa" w:w="3431"/>
+            <w:tcMar>
+              <w:top w:type="dxa" w:w="60"/>
+              <w:left w:type="dxa" w:w="90"/>
+              <w:bottom w:type="dxa" w:w="60"/>
+              <w:right w:type="dxa" w:w="90"/>
+            </w:tcMar>
+          </w:tcPr>
+          <w:p>
+            <w:pPr>
+              <w:spacing w:after="0" w:line="252"/>
+            </w:pPr>
+            <w:r>
+              <w:rPr>
+                <w:rFonts w:ascii="Calibri" w:cs="Calibri" w:eastAsia="Calibri" w:hAnsi="Calibri"/>
+                <w:b w:val="false"/>
+                <w:bCs w:val="false"/>
+                <w:i w:val="false"/>
+                <w:iCs w:val="false"/>
+                <w:color w:val="1F2933"/>
+                <w:sz w:val="19"/>
+                <w:szCs w:val="19"/>
+              </w:rPr>
+              <w:t xml:space="preserve">Mọi thứ còn lại, kể cả nhánh AI</w:t>
+            </w:r>
+          </w:p>
+        </w:tc>
+      </w:tr>
+    </w:tbl>
+    <w:p>
+      <w:pPr>
+        <w:spacing w:after="160"/>
+      </w:pPr>
+    </w:p>
+    <w:p>
+      <w:pPr>
+        <w:spacing w:after="140" w:line="276"/>
+        <w:jc w:val="left"/>
+      </w:pPr>
+      <w:r>
+        <w:rPr>
+          <w:rFonts w:ascii="Calibri" w:cs="Calibri" w:eastAsia="Calibri" w:hAnsi="Calibri"/>
+          <w:b w:val="false"/>
+          <w:bCs w:val="false"/>
+          <w:i w:val="false"/>
+          <w:iCs w:val="false"/>
+          <w:color w:val="1F2933"/>
+          <w:sz w:val="21"/>
+          <w:szCs w:val="21"/>
+        </w:rPr>
+        <w:t xml:space="preserve">Ba điều kiện giữ được tính chất này; </w:t>
+      </w:r>
+      <w:r>
+        <w:rPr>
+          <w:rFonts w:ascii="Calibri" w:cs="Calibri" w:eastAsia="Calibri" w:hAnsi="Calibri"/>
+          <w:b/>
+          <w:bCs/>
+          <w:i w:val="false"/>
+          <w:iCs w:val="false"/>
+          <w:color w:val="1F2933"/>
+          <w:sz w:val="21"/>
+          <w:szCs w:val="21"/>
+        </w:rPr>
+        <w:t xml:space="preserve">phải kiểm lại mỗi lần sửa module Thiết kế</w:t>
+      </w:r>
+      <w:r>
+        <w:rPr>
+          <w:rFonts w:ascii="Calibri" w:cs="Calibri" w:eastAsia="Calibri" w:hAnsi="Calibri"/>
+          <w:b w:val="false"/>
+          <w:bCs w:val="false"/>
+          <w:i w:val="false"/>
+          <w:iCs w:val="false"/>
+          <w:color w:val="1F2933"/>
+          <w:sz w:val="21"/>
+          <w:szCs w:val="21"/>
+        </w:rPr>
+        <w:t xml:space="preserve">:</w:t>
+      </w:r>
+    </w:p>
+    <w:p>
+      <w:pPr>
+        <w:pStyle w:val="ListParagraph"/>
+        <w:numPr>
+          <w:ilvl w:val="0"/>
+          <w:numId w:val="4"/>
+        </w:numPr>
+        <w:spacing w:after="70" w:line="276"/>
+      </w:pPr>
+      <w:r>
+        <w:rPr>
+          <w:rFonts w:ascii="Calibri" w:cs="Calibri" w:eastAsia="Calibri" w:hAnsi="Calibri"/>
+          <w:b/>
+          <w:bCs/>
+          <w:i w:val="false"/>
+          <w:iCs w:val="false"/>
+          <w:color w:val="1F2933"/>
+          <w:sz w:val="21"/>
+          <w:szCs w:val="21"/>
+        </w:rPr>
+        <w:t xml:space="preserve">Không bước nào của luồng thủ công lấy kết quả AI làm đầu vào bắt buộc.</w:t>
+      </w:r>
+      <w:r>
+        <w:rPr>
+          <w:rFonts w:ascii="Calibri" w:cs="Calibri" w:eastAsia="Calibri" w:hAnsi="Calibri"/>
+          <w:b w:val="false"/>
+          <w:bCs w:val="false"/>
+          <w:i w:val="false"/>
+          <w:iCs w:val="false"/>
+          <w:color w:val="1F2933"/>
+          <w:sz w:val="21"/>
+          <w:szCs w:val="21"/>
+        </w:rPr>
+        <w:t xml:space="preserve"> Bản vẽ phát hành đến từ tệp kiến trúc sư tải lên; kết quả AI là bản phác tham khảo và không đi vào hồ sơ phát hành.</w:t>
+      </w:r>
+    </w:p>
+    <w:p>
+      <w:pPr>
+        <w:pStyle w:val="ListParagraph"/>
+        <w:numPr>
+          <w:ilvl w:val="0"/>
+          <w:numId w:val="4"/>
+        </w:numPr>
+        <w:spacing w:after="70" w:line="276"/>
+      </w:pPr>
+      <w:r>
+        <w:rPr>
+          <w:rFonts w:ascii="Calibri" w:cs="Calibri" w:eastAsia="Calibri" w:hAnsi="Calibri"/>
+          <w:b/>
+          <w:bCs/>
+          <w:i w:val="false"/>
+          <w:iCs w:val="false"/>
+          <w:color w:val="1F2933"/>
+          <w:sz w:val="21"/>
+          <w:szCs w:val="21"/>
+        </w:rPr>
+        <w:t xml:space="preserve">Nhánh AI nằm gọn trong một tab riêng</w:t>
+      </w:r>
+      <w:r>
+        <w:rPr>
+          <w:rFonts w:ascii="Calibri" w:cs="Calibri" w:eastAsia="Calibri" w:hAnsi="Calibri"/>
+          <w:b w:val="false"/>
+          <w:bCs w:val="false"/>
+          <w:i w:val="false"/>
+          <w:iCs w:val="false"/>
+          <w:color w:val="1F2933"/>
+          <w:sz w:val="21"/>
+          <w:szCs w:val="21"/>
+        </w:rPr>
+        <w:t xml:space="preserve"> của màn hình hồ sơ thiết kế, không phải một bước chắn ngang giữa hai bước khác. Tab chính của màn hình là Tổng quan, Phiên bản bản vẽ và Yêu cầu thay đổi.</w:t>
+      </w:r>
+    </w:p>
+    <w:p>
+      <w:pPr>
+        <w:pStyle w:val="ListParagraph"/>
+        <w:numPr>
+          <w:ilvl w:val="0"/>
+          <w:numId w:val="4"/>
+        </w:numPr>
+        <w:spacing w:after="70" w:line="276"/>
+      </w:pPr>
+      <w:r>
+        <w:rPr>
+          <w:rFonts w:ascii="Calibri" w:cs="Calibri" w:eastAsia="Calibri" w:hAnsi="Calibri"/>
+          <w:b/>
+          <w:bCs/>
+          <w:i w:val="false"/>
+          <w:iCs w:val="false"/>
+          <w:color w:val="1F2933"/>
+          <w:sz w:val="21"/>
+          <w:szCs w:val="21"/>
+        </w:rPr>
+        <w:t xml:space="preserve">Tắt được bằng cấu hình, không phải bằng sửa mã.</w:t>
+      </w:r>
+      <w:r>
+        <w:rPr>
+          <w:rFonts w:ascii="Calibri" w:cs="Calibri" w:eastAsia="Calibri" w:hAnsi="Calibri"/>
+          <w:b w:val="false"/>
+          <w:bCs w:val="false"/>
+          <w:i w:val="false"/>
+          <w:iCs w:val="false"/>
+          <w:color w:val="1F2933"/>
+          <w:sz w:val="21"/>
+          <w:szCs w:val="21"/>
+        </w:rPr>
+        <w:t xml:space="preserve"> Mỗi tuyến mô hình có công tắc bật/tắt riêng; tuyến tắt hoặc thiếu khoá thì phần AI nói rõ chưa dùng được, các tab khác không đổi hành vi.</w:t>
+      </w:r>
+    </w:p>
+    <w:p>
+      <w:pPr>
+        <w:spacing w:after="140" w:line="276"/>
+        <w:jc w:val="left"/>
+      </w:pPr>
+      <w:r>
+        <w:rPr>
+          <w:rFonts w:ascii="Calibri" w:cs="Calibri" w:eastAsia="Calibri" w:hAnsi="Calibri"/>
+          <w:b/>
+          <w:bCs/>
+          <w:i w:val="false"/>
+          <w:iCs w:val="false"/>
+          <w:color w:val="1F2933"/>
+          <w:sz w:val="21"/>
+          <w:szCs w:val="21"/>
+        </w:rPr>
+        <w:t xml:space="preserve">Trần chi tiêu cho lượt gọi mô hình</w:t>
+      </w:r>
+    </w:p>
+    <w:p>
+      <w:pPr>
+        <w:spacing w:after="140" w:line="276"/>
+        <w:jc w:val="left"/>
+      </w:pPr>
+      <w:r>
+        <w:rPr>
+          <w:rFonts w:ascii="Calibri" w:cs="Calibri" w:eastAsia="Calibri" w:hAnsi="Calibri"/>
+          <w:b w:val="false"/>
+          <w:bCs w:val="false"/>
+          <w:i w:val="false"/>
+          <w:iCs w:val="false"/>
+          <w:color w:val="1F2933"/>
+          <w:sz w:val="21"/>
+          <w:szCs w:val="21"/>
+        </w:rPr>
+        <w:t xml:space="preserve">Chi phí AI là một rủi ro tiền bạc có thật, nên nó được chặn bằng </w:t>
+      </w:r>
+      <w:r>
+        <w:rPr>
+          <w:rFonts w:ascii="Calibri" w:cs="Calibri" w:eastAsia="Calibri" w:hAnsi="Calibri"/>
+          <w:b/>
+          <w:bCs/>
+          <w:i w:val="false"/>
+          <w:iCs w:val="false"/>
+          <w:color w:val="1F2933"/>
+          <w:sz w:val="21"/>
+          <w:szCs w:val="21"/>
+        </w:rPr>
+        <w:t xml:space="preserve">ngắt mạch tự động</w:t>
+      </w:r>
+      <w:r>
+        <w:rPr>
+          <w:rFonts w:ascii="Calibri" w:cs="Calibri" w:eastAsia="Calibri" w:hAnsi="Calibri"/>
+          <w:b w:val="false"/>
+          <w:bCs w:val="false"/>
+          <w:i w:val="false"/>
+          <w:iCs w:val="false"/>
+          <w:color w:val="1F2933"/>
+          <w:sz w:val="21"/>
+          <w:szCs w:val="21"/>
+        </w:rPr>
+        <w:t xml:space="preserve">, không dựa vào việc có người để ý kịp. Thiết kế theo đúng nguyên tắc tham số hoá của hệ thống: </w:t>
+      </w:r>
+      <w:r>
+        <w:rPr>
+          <w:rFonts w:ascii="Calibri" w:cs="Calibri" w:eastAsia="Calibri" w:hAnsi="Calibri"/>
+          <w:b/>
+          <w:bCs/>
+          <w:i w:val="false"/>
+          <w:iCs w:val="false"/>
+          <w:color w:val="1F2933"/>
+          <w:sz w:val="21"/>
+          <w:szCs w:val="21"/>
+        </w:rPr>
+        <w:t xml:space="preserve">cơ chế nằm trong mã, con số nằm trong bảng cấu hình</w:t>
+      </w:r>
+      <w:r>
+        <w:rPr>
+          <w:rFonts w:ascii="Calibri" w:cs="Calibri" w:eastAsia="Calibri" w:hAnsi="Calibri"/>
+          <w:b w:val="false"/>
+          <w:bCs w:val="false"/>
+          <w:i w:val="false"/>
+          <w:iCs w:val="false"/>
+          <w:color w:val="1F2933"/>
+          <w:sz w:val="21"/>
+          <w:szCs w:val="21"/>
+        </w:rPr>
+        <w:t xml:space="preserve">.</w:t>
+      </w:r>
+    </w:p>
+    <w:tbl>
+      <w:tblPr>
+        <w:tblW w:type="dxa" w:w="9638"/>
+        <w:tblBorders>
+          <w:top w:val="single" w:color="C9D2CE" w:sz="4"/>
+          <w:left w:val="single" w:color="C9D2CE" w:sz="4"/>
+          <w:bottom w:val="single" w:color="C9D2CE" w:sz="4"/>
+          <w:right w:val="single" w:color="C9D2CE" w:sz="4"/>
+          <w:insideH w:val="single" w:color="C9D2CE" w:sz="4"/>
+          <w:insideV w:val="single" w:color="C9D2CE" w:sz="4"/>
+        </w:tblBorders>
+      </w:tblPr>
+      <w:tblGrid>
+        <w:gridCol w:w="3019"/>
+        <w:gridCol w:w="6619"/>
+      </w:tblGrid>
+      <w:tr>
+        <w:trPr>
+          <w:tblHeader/>
+        </w:trPr>
+        <w:tc>
+          <w:tcPr>
+            <w:tcW w:type="dxa" w:w="3019"/>
+            <w:shd w:fill="EAF1EE" w:color="auto" w:val="clear"/>
+            <w:tcMar>
+              <w:top w:type="dxa" w:w="60"/>
+              <w:left w:type="dxa" w:w="90"/>
+              <w:bottom w:type="dxa" w:w="60"/>
+              <w:right w:type="dxa" w:w="90"/>
+            </w:tcMar>
+          </w:tcPr>
+          <w:p>
+            <w:pPr>
+              <w:spacing w:after="0" w:line="252"/>
+            </w:pPr>
+            <w:r>
+              <w:rPr>
+                <w:rFonts w:ascii="Calibri" w:cs="Calibri" w:eastAsia="Calibri" w:hAnsi="Calibri"/>
+                <w:b/>
+                <w:bCs/>
+                <w:i w:val="false"/>
+                <w:iCs w:val="false"/>
+                <w:color w:val="1F2933"/>
+                <w:sz w:val="19"/>
+                <w:szCs w:val="19"/>
+              </w:rPr>
+              <w:t xml:space="preserve">Hạng mục</w:t>
+            </w:r>
+          </w:p>
+        </w:tc>
+        <w:tc>
+          <w:tcPr>
+            <w:tcW w:type="dxa" w:w="6619"/>
+            <w:shd w:fill="EAF1EE" w:color="auto" w:val="clear"/>
+            <w:tcMar>
+              <w:top w:type="dxa" w:w="60"/>
+              <w:left w:type="dxa" w:w="90"/>
+              <w:bottom w:type="dxa" w:w="60"/>
+              <w:right w:type="dxa" w:w="90"/>
+            </w:tcMar>
+          </w:tcPr>
+          <w:p>
+            <w:pPr>
+              <w:spacing w:after="0" w:line="252"/>
+            </w:pPr>
+            <w:r>
+              <w:rPr>
+                <w:rFonts w:ascii="Calibri" w:cs="Calibri" w:eastAsia="Calibri" w:hAnsi="Calibri"/>
+                <w:b/>
+                <w:bCs/>
+                <w:i w:val="false"/>
+                <w:iCs w:val="false"/>
+                <w:color w:val="1F2933"/>
+                <w:sz w:val="19"/>
+                <w:szCs w:val="19"/>
+              </w:rPr>
+              <w:t xml:space="preserve">Thiết kế</w:t>
+            </w:r>
+          </w:p>
+        </w:tc>
+      </w:tr>
+      <w:tr>
+        <w:trPr>
+          <w:cantSplit/>
+        </w:trPr>
+        <w:tc>
+          <w:tcPr>
+            <w:tcW w:type="dxa" w:w="3019"/>
+            <w:tcMar>
+              <w:top w:type="dxa" w:w="60"/>
+              <w:left w:type="dxa" w:w="90"/>
+              <w:bottom w:type="dxa" w:w="60"/>
+              <w:right w:type="dxa" w:w="90"/>
+            </w:tcMar>
+          </w:tcPr>
+          <w:p>
+            <w:pPr>
+              <w:spacing w:after="0" w:line="252"/>
+            </w:pPr>
+            <w:r>
+              <w:rPr>
+                <w:rFonts w:ascii="Calibri" w:cs="Calibri" w:eastAsia="Calibri" w:hAnsi="Calibri"/>
+                <w:b w:val="false"/>
+                <w:bCs w:val="false"/>
+                <w:i w:val="false"/>
+                <w:iCs w:val="false"/>
+                <w:color w:val="1F2933"/>
+                <w:sz w:val="19"/>
+                <w:szCs w:val="19"/>
+              </w:rPr>
+              <w:t xml:space="preserve">Đo bằng gì</w:t>
+            </w:r>
+          </w:p>
+        </w:tc>
+        <w:tc>
+          <w:tcPr>
+            <w:tcW w:type="dxa" w:w="6619"/>
+            <w:tcMar>
+              <w:top w:type="dxa" w:w="60"/>
+              <w:left w:type="dxa" w:w="90"/>
+              <w:bottom w:type="dxa" w:w="60"/>
+              <w:right w:type="dxa" w:w="90"/>
+            </w:tcMar>
+          </w:tcPr>
+          <w:p>
+            <w:pPr>
+              <w:spacing w:after="0" w:line="252"/>
+            </w:pPr>
+            <w:r>
+              <w:rPr>
+                <w:rFonts w:ascii="Calibri" w:cs="Calibri" w:eastAsia="Calibri" w:hAnsi="Calibri"/>
+                <w:b w:val="false"/>
+                <w:bCs w:val="false"/>
+                <w:i w:val="false"/>
+                <w:iCs w:val="false"/>
+                <w:color w:val="1F2933"/>
+                <w:sz w:val="19"/>
+                <w:szCs w:val="19"/>
+              </w:rPr>
+              <w:t xml:space="preserve">Cộng chi phí đã ghi của từng lượt gọi trong kỳ, tách theo </w:t>
+            </w:r>
+            <w:r>
+              <w:rPr>
+                <w:rFonts w:ascii="Calibri" w:cs="Calibri" w:eastAsia="Calibri" w:hAnsi="Calibri"/>
+                <w:b/>
+                <w:bCs/>
+                <w:i w:val="false"/>
+                <w:iCs w:val="false"/>
+                <w:color w:val="1F2933"/>
+                <w:sz w:val="19"/>
+                <w:szCs w:val="19"/>
+              </w:rPr>
+              <w:t xml:space="preserve">pháp nhân</w:t>
+            </w:r>
+          </w:p>
+        </w:tc>
+      </w:tr>
+      <w:tr>
+        <w:trPr>
+          <w:cantSplit/>
+        </w:trPr>
+        <w:tc>
+          <w:tcPr>
+            <w:tcW w:type="dxa" w:w="3019"/>
+            <w:tcMar>
+              <w:top w:type="dxa" w:w="60"/>
+              <w:left w:type="dxa" w:w="90"/>
+              <w:bottom w:type="dxa" w:w="60"/>
+              <w:right w:type="dxa" w:w="90"/>
+            </w:tcMar>
+          </w:tcPr>
+          <w:p>
+            <w:pPr>
+              <w:spacing w:after="0" w:line="252"/>
+            </w:pPr>
+            <w:r>
+              <w:rPr>
+                <w:rFonts w:ascii="Calibri" w:cs="Calibri" w:eastAsia="Calibri" w:hAnsi="Calibri"/>
+                <w:b w:val="false"/>
+                <w:bCs w:val="false"/>
+                <w:i w:val="false"/>
+                <w:iCs w:val="false"/>
+                <w:color w:val="1F2933"/>
+                <w:sz w:val="19"/>
+                <w:szCs w:val="19"/>
+              </w:rPr>
+              <w:t xml:space="preserve">Hai ngưỡng</w:t>
+            </w:r>
+          </w:p>
+        </w:tc>
+        <w:tc>
+          <w:tcPr>
+            <w:tcW w:type="dxa" w:w="6619"/>
+            <w:tcMar>
+              <w:top w:type="dxa" w:w="60"/>
+              <w:left w:type="dxa" w:w="90"/>
+              <w:bottom w:type="dxa" w:w="60"/>
+              <w:right w:type="dxa" w:w="90"/>
+            </w:tcMar>
+          </w:tcPr>
+          <w:p>
+            <w:pPr>
+              <w:spacing w:after="0" w:line="252"/>
+            </w:pPr>
+            <w:r>
+              <w:rPr>
+                <w:rFonts w:ascii="Calibri" w:cs="Calibri" w:eastAsia="Calibri" w:hAnsi="Calibri"/>
+                <w:b/>
+                <w:bCs/>
+                <w:i w:val="false"/>
+                <w:iCs w:val="false"/>
+                <w:color w:val="1F2933"/>
+                <w:sz w:val="19"/>
+                <w:szCs w:val="19"/>
+              </w:rPr>
+              <w:t xml:space="preserve">Ngưỡng cảnh báo</w:t>
+            </w:r>
+            <w:r>
+              <w:rPr>
+                <w:rFonts w:ascii="Calibri" w:cs="Calibri" w:eastAsia="Calibri" w:hAnsi="Calibri"/>
+                <w:b w:val="false"/>
+                <w:bCs w:val="false"/>
+                <w:i w:val="false"/>
+                <w:iCs w:val="false"/>
+                <w:color w:val="1F2933"/>
+                <w:sz w:val="19"/>
+                <w:szCs w:val="19"/>
+              </w:rPr>
+              <w:t xml:space="preserve"> — hiện dải báo, vẫn cho chạy. </w:t>
+            </w:r>
+            <w:r>
+              <w:rPr>
+                <w:rFonts w:ascii="Calibri" w:cs="Calibri" w:eastAsia="Calibri" w:hAnsi="Calibri"/>
+                <w:b/>
+                <w:bCs/>
+                <w:i w:val="false"/>
+                <w:iCs w:val="false"/>
+                <w:color w:val="1F2933"/>
+                <w:sz w:val="19"/>
+                <w:szCs w:val="19"/>
+              </w:rPr>
+              <w:t xml:space="preserve">Trần</w:t>
+            </w:r>
+            <w:r>
+              <w:rPr>
+                <w:rFonts w:ascii="Calibri" w:cs="Calibri" w:eastAsia="Calibri" w:hAnsi="Calibri"/>
+                <w:b w:val="false"/>
+                <w:bCs w:val="false"/>
+                <w:i w:val="false"/>
+                <w:iCs w:val="false"/>
+                <w:color w:val="1F2933"/>
+                <w:sz w:val="19"/>
+                <w:szCs w:val="19"/>
+              </w:rPr>
+              <w:t xml:space="preserve"> — không nhận lượt chạy mới</w:t>
+            </w:r>
+          </w:p>
+        </w:tc>
+      </w:tr>
+      <w:tr>
+        <w:trPr>
+          <w:cantSplit/>
+        </w:trPr>
+        <w:tc>
+          <w:tcPr>
+            <w:tcW w:type="dxa" w:w="3019"/>
+            <w:tcMar>
+              <w:top w:type="dxa" w:w="60"/>
+              <w:left w:type="dxa" w:w="90"/>
+              <w:bottom w:type="dxa" w:w="60"/>
+              <w:right w:type="dxa" w:w="90"/>
+            </w:tcMar>
+          </w:tcPr>
+          <w:p>
+            <w:pPr>
+              <w:spacing w:after="0" w:line="252"/>
+            </w:pPr>
+            <w:r>
+              <w:rPr>
+                <w:rFonts w:ascii="Calibri" w:cs="Calibri" w:eastAsia="Calibri" w:hAnsi="Calibri"/>
+                <w:b w:val="false"/>
+                <w:bCs w:val="false"/>
+                <w:i w:val="false"/>
+                <w:iCs w:val="false"/>
+                <w:color w:val="1F2933"/>
+                <w:sz w:val="19"/>
+                <w:szCs w:val="19"/>
+              </w:rPr>
+              <w:t xml:space="preserve">Kiểm ở đâu</w:t>
+            </w:r>
+          </w:p>
+        </w:tc>
+        <w:tc>
+          <w:tcPr>
+            <w:tcW w:type="dxa" w:w="6619"/>
+            <w:tcMar>
+              <w:top w:type="dxa" w:w="60"/>
+              <w:left w:type="dxa" w:w="90"/>
+              <w:bottom w:type="dxa" w:w="60"/>
+              <w:right w:type="dxa" w:w="90"/>
+            </w:tcMar>
+          </w:tcPr>
+          <w:p>
+            <w:pPr>
+              <w:spacing w:after="0" w:line="252"/>
+            </w:pPr>
+            <w:r>
+              <w:rPr>
+                <w:rFonts w:ascii="Calibri" w:cs="Calibri" w:eastAsia="Calibri" w:hAnsi="Calibri"/>
+                <w:b/>
+                <w:bCs/>
+                <w:i w:val="false"/>
+                <w:iCs w:val="false"/>
+                <w:color w:val="1F2933"/>
+                <w:sz w:val="19"/>
+                <w:szCs w:val="19"/>
+              </w:rPr>
+              <w:t xml:space="preserve">Trước khi khởi động một lượt chạy</w:t>
+            </w:r>
+            <w:r>
+              <w:rPr>
+                <w:rFonts w:ascii="Calibri" w:cs="Calibri" w:eastAsia="Calibri" w:hAnsi="Calibri"/>
+                <w:b w:val="false"/>
+                <w:bCs w:val="false"/>
+                <w:i w:val="false"/>
+                <w:iCs w:val="false"/>
+                <w:color w:val="1F2933"/>
+                <w:sz w:val="19"/>
+                <w:szCs w:val="19"/>
+              </w:rPr>
+              <w:t xml:space="preserve">, không kiểm giữa chừng: cắt ngang một lượt đang chạy là mất tiền đã tiêu mà không có sản phẩm. Lượt đã bắt đầu thì chạy nốt</w:t>
+            </w:r>
+          </w:p>
+        </w:tc>
+      </w:tr>
+      <w:tr>
+        <w:trPr>
+          <w:cantSplit/>
+        </w:trPr>
+        <w:tc>
+          <w:tcPr>
+            <w:tcW w:type="dxa" w:w="3019"/>
+            <w:tcMar>
+              <w:top w:type="dxa" w:w="60"/>
+              <w:left w:type="dxa" w:w="90"/>
+              <w:bottom w:type="dxa" w:w="60"/>
+              <w:right w:type="dxa" w:w="90"/>
+            </w:tcMar>
+          </w:tcPr>
+          <w:p>
+            <w:pPr>
+              <w:spacing w:after="0" w:line="252"/>
+            </w:pPr>
+            <w:r>
+              <w:rPr>
+                <w:rFonts w:ascii="Calibri" w:cs="Calibri" w:eastAsia="Calibri" w:hAnsi="Calibri"/>
+                <w:b w:val="false"/>
+                <w:bCs w:val="false"/>
+                <w:i w:val="false"/>
+                <w:iCs w:val="false"/>
+                <w:color w:val="1F2933"/>
+                <w:sz w:val="19"/>
+                <w:szCs w:val="19"/>
+              </w:rPr>
+              <w:t xml:space="preserve">Chạm trần thì sao</w:t>
+            </w:r>
+          </w:p>
+        </w:tc>
+        <w:tc>
+          <w:tcPr>
+            <w:tcW w:type="dxa" w:w="6619"/>
+            <w:tcMar>
+              <w:top w:type="dxa" w:w="60"/>
+              <w:left w:type="dxa" w:w="90"/>
+              <w:bottom w:type="dxa" w:w="60"/>
+              <w:right w:type="dxa" w:w="90"/>
+            </w:tcMar>
+          </w:tcPr>
+          <w:p>
+            <w:pPr>
+              <w:spacing w:after="0" w:line="252"/>
+            </w:pPr>
+            <w:r>
+              <w:rPr>
+                <w:rFonts w:ascii="Calibri" w:cs="Calibri" w:eastAsia="Calibri" w:hAnsi="Calibri"/>
+                <w:b w:val="false"/>
+                <w:bCs w:val="false"/>
+                <w:i w:val="false"/>
+                <w:iCs w:val="false"/>
+                <w:color w:val="1F2933"/>
+                <w:sz w:val="19"/>
+                <w:szCs w:val="19"/>
+              </w:rPr>
+              <w:t xml:space="preserve">Nhánh AI dừng nhận việc mới; </w:t>
+            </w:r>
+            <w:r>
+              <w:rPr>
+                <w:rFonts w:ascii="Calibri" w:cs="Calibri" w:eastAsia="Calibri" w:hAnsi="Calibri"/>
+                <w:b/>
+                <w:bCs/>
+                <w:i w:val="false"/>
+                <w:iCs w:val="false"/>
+                <w:color w:val="1F2933"/>
+                <w:sz w:val="19"/>
+                <w:szCs w:val="19"/>
+              </w:rPr>
+              <w:t xml:space="preserve">luồng thiết kế thủ công không đổi hành vi</w:t>
+            </w:r>
+            <w:r>
+              <w:rPr>
+                <w:rFonts w:ascii="Calibri" w:cs="Calibri" w:eastAsia="Calibri" w:hAnsi="Calibri"/>
+                <w:b w:val="false"/>
+                <w:bCs w:val="false"/>
+                <w:i w:val="false"/>
+                <w:iCs w:val="false"/>
+                <w:color w:val="1F2933"/>
+                <w:sz w:val="19"/>
+                <w:szCs w:val="19"/>
+              </w:rPr>
+              <w:t xml:space="preserve">. Câu báo nói rõ ai nâng được trần</w:t>
+            </w:r>
+          </w:p>
+        </w:tc>
+      </w:tr>
+      <w:tr>
+        <w:trPr>
+          <w:cantSplit/>
+        </w:trPr>
+        <w:tc>
+          <w:tcPr>
+            <w:tcW w:type="dxa" w:w="3019"/>
+            <w:tcMar>
+              <w:top w:type="dxa" w:w="60"/>
+              <w:left w:type="dxa" w:w="90"/>
+              <w:bottom w:type="dxa" w:w="60"/>
+              <w:right w:type="dxa" w:w="90"/>
+            </w:tcMar>
+          </w:tcPr>
+          <w:p>
+            <w:pPr>
+              <w:spacing w:after="0" w:line="252"/>
+            </w:pPr>
+            <w:r>
+              <w:rPr>
+                <w:rFonts w:ascii="Calibri" w:cs="Calibri" w:eastAsia="Calibri" w:hAnsi="Calibri"/>
+                <w:b w:val="false"/>
+                <w:bCs w:val="false"/>
+                <w:i w:val="false"/>
+                <w:iCs w:val="false"/>
+                <w:color w:val="1F2933"/>
+                <w:sz w:val="19"/>
+                <w:szCs w:val="19"/>
+              </w:rPr>
+              <w:t xml:space="preserve">Ai đổi được số</w:t>
+            </w:r>
+          </w:p>
+        </w:tc>
+        <w:tc>
+          <w:tcPr>
+            <w:tcW w:type="dxa" w:w="6619"/>
+            <w:tcMar>
+              <w:top w:type="dxa" w:w="60"/>
+              <w:left w:type="dxa" w:w="90"/>
+              <w:bottom w:type="dxa" w:w="60"/>
+              <w:right w:type="dxa" w:w="90"/>
+            </w:tcMar>
+          </w:tcPr>
+          <w:p>
+            <w:pPr>
+              <w:spacing w:after="0" w:line="252"/>
+            </w:pPr>
+            <w:r>
+              <w:rPr>
+                <w:rFonts w:ascii="Calibri" w:cs="Calibri" w:eastAsia="Calibri" w:hAnsi="Calibri"/>
+                <w:b w:val="false"/>
+                <w:bCs w:val="false"/>
+                <w:i w:val="false"/>
+                <w:iCs w:val="false"/>
+                <w:color w:val="1F2933"/>
+                <w:sz w:val="19"/>
+                <w:szCs w:val="19"/>
+              </w:rPr>
+              <w:t xml:space="preserve">Người có quyền quản trị tham số hệ thống, sửa khi đang chạy, không cần phát hành lại</w:t>
+            </w:r>
+          </w:p>
+        </w:tc>
+      </w:tr>
+      <w:tr>
+        <w:trPr>
+          <w:cantSplit/>
+        </w:trPr>
+        <w:tc>
+          <w:tcPr>
+            <w:tcW w:type="dxa" w:w="3019"/>
+            <w:tcMar>
+              <w:top w:type="dxa" w:w="60"/>
+              <w:left w:type="dxa" w:w="90"/>
+              <w:bottom w:type="dxa" w:w="60"/>
+              <w:right w:type="dxa" w:w="90"/>
+            </w:tcMar>
+          </w:tcPr>
+          <w:p>
+            <w:pPr>
+              <w:spacing w:after="0" w:line="252"/>
+            </w:pPr>
+            <w:r>
+              <w:rPr>
+                <w:rFonts w:ascii="Calibri" w:cs="Calibri" w:eastAsia="Calibri" w:hAnsi="Calibri"/>
+                <w:b w:val="false"/>
+                <w:bCs w:val="false"/>
+                <w:i w:val="false"/>
+                <w:iCs w:val="false"/>
+                <w:color w:val="1F2933"/>
+                <w:sz w:val="19"/>
+                <w:szCs w:val="19"/>
+              </w:rPr>
+              <w:t xml:space="preserve">Chưa cấu hình thì sao</w:t>
+            </w:r>
+          </w:p>
+        </w:tc>
+        <w:tc>
+          <w:tcPr>
+            <w:tcW w:type="dxa" w:w="6619"/>
+            <w:tcMar>
+              <w:top w:type="dxa" w:w="60"/>
+              <w:left w:type="dxa" w:w="90"/>
+              <w:bottom w:type="dxa" w:w="60"/>
+              <w:right w:type="dxa" w:w="90"/>
+            </w:tcMar>
+          </w:tcPr>
+          <w:p>
+            <w:pPr>
+              <w:spacing w:after="0" w:line="252"/>
+            </w:pPr>
+            <w:r>
+              <w:rPr>
+                <w:rFonts w:ascii="Calibri" w:cs="Calibri" w:eastAsia="Calibri" w:hAnsi="Calibri"/>
+                <w:b/>
+                <w:bCs/>
+                <w:i w:val="false"/>
+                <w:iCs w:val="false"/>
+                <w:color w:val="1F2933"/>
+                <w:sz w:val="19"/>
+                <w:szCs w:val="19"/>
+              </w:rPr>
+              <w:t xml:space="preserve">Không áp trần</w:t>
+            </w:r>
+            <w:r>
+              <w:rPr>
+                <w:rFonts w:ascii="Calibri" w:cs="Calibri" w:eastAsia="Calibri" w:hAnsi="Calibri"/>
+                <w:b w:val="false"/>
+                <w:bCs w:val="false"/>
+                <w:i w:val="false"/>
+                <w:iCs w:val="false"/>
+                <w:color w:val="1F2933"/>
+                <w:sz w:val="19"/>
+                <w:szCs w:val="19"/>
+              </w:rPr>
+              <w:t xml:space="preserve"> — đúng như mọi tham số khác của hệ thống: chưa khai thì hàm đọc trả về rỗng, nơi gọi tự quyết. Đây là trạng thái </w:t>
+            </w:r>
+            <w:r>
+              <w:rPr>
+                <w:rFonts w:ascii="Calibri" w:cs="Calibri" w:eastAsia="Calibri" w:hAnsi="Calibri"/>
+                <w:b/>
+                <w:bCs/>
+                <w:i w:val="false"/>
+                <w:iCs w:val="false"/>
+                <w:color w:val="1F2933"/>
+                <w:sz w:val="19"/>
+                <w:szCs w:val="19"/>
+              </w:rPr>
+              <w:t xml:space="preserve">có chủ đích</w:t>
+            </w:r>
+            <w:r>
+              <w:rPr>
+                <w:rFonts w:ascii="Calibri" w:cs="Calibri" w:eastAsia="Calibri" w:hAnsi="Calibri"/>
+                <w:b w:val="false"/>
+                <w:bCs w:val="false"/>
+                <w:i w:val="false"/>
+                <w:iCs w:val="false"/>
+                <w:color w:val="1F2933"/>
+                <w:sz w:val="19"/>
+                <w:szCs w:val="19"/>
+              </w:rPr>
+              <w:t xml:space="preserve"> của giai đoạn phát triển và chạy thử</w:t>
+            </w:r>
+          </w:p>
+        </w:tc>
+      </w:tr>
+    </w:tbl>
+    <w:p>
+      <w:pPr>
+        <w:spacing w:after="160"/>
+      </w:pPr>
+    </w:p>
+    <w:p>
+      <w:pPr>
+        <w:spacing w:after="140" w:line="276"/>
+        <w:jc w:val="left"/>
+      </w:pPr>
+      <w:r>
+        <w:rPr>
+          <w:rFonts w:ascii="Calibri" w:cs="Calibri" w:eastAsia="Calibri" w:hAnsi="Calibri"/>
+          <w:b w:val="false"/>
+          <w:bCs w:val="false"/>
+          <w:i w:val="false"/>
+          <w:iCs w:val="false"/>
+          <w:color w:val="1F2933"/>
+          <w:sz w:val="21"/>
+          <w:szCs w:val="21"/>
+        </w:rPr>
+        <w:t xml:space="preserve">Một giới hạn phải nói rõ: con số cộng được là </w:t>
+      </w:r>
+      <w:r>
+        <w:rPr>
+          <w:rFonts w:ascii="Calibri" w:cs="Calibri" w:eastAsia="Calibri" w:hAnsi="Calibri"/>
+          <w:b/>
+          <w:bCs/>
+          <w:i w:val="false"/>
+          <w:iCs w:val="false"/>
+          <w:color w:val="1F2933"/>
+          <w:sz w:val="21"/>
+          <w:szCs w:val="21"/>
+        </w:rPr>
+        <w:t xml:space="preserve">ước tính theo bảng giá đã khai</w:t>
+      </w:r>
+      <w:r>
+        <w:rPr>
+          <w:rFonts w:ascii="Calibri" w:cs="Calibri" w:eastAsia="Calibri" w:hAnsi="Calibri"/>
+          <w:b w:val="false"/>
+          <w:bCs w:val="false"/>
+          <w:i w:val="false"/>
+          <w:iCs w:val="false"/>
+          <w:color w:val="1F2933"/>
+          <w:sz w:val="21"/>
+          <w:szCs w:val="21"/>
+        </w:rPr>
+        <w:t xml:space="preserve"> trong tệp cấu hình mô hình tại thời điểm gọi, không phải hoá đơn của nhà cung cấp. Tuyến nào không khai giá thì lượt gọi của nó không vào được tổng. Trần này vì thế là hàng rào chặn thiệt hại, </w:t>
+      </w:r>
+      <w:r>
+        <w:rPr>
+          <w:rFonts w:ascii="Calibri" w:cs="Calibri" w:eastAsia="Calibri" w:hAnsi="Calibri"/>
+          <w:b/>
+          <w:bCs/>
+          <w:i w:val="false"/>
+          <w:iCs w:val="false"/>
+          <w:color w:val="1F2933"/>
+          <w:sz w:val="21"/>
+          <w:szCs w:val="21"/>
+        </w:rPr>
+        <w:t xml:space="preserve">không thay cho việc đối chiếu hoá đơn thật</w:t>
+      </w:r>
+      <w:r>
+        <w:rPr>
+          <w:rFonts w:ascii="Calibri" w:cs="Calibri" w:eastAsia="Calibri" w:hAnsi="Calibri"/>
+          <w:b w:val="false"/>
+          <w:bCs w:val="false"/>
+          <w:i w:val="false"/>
+          <w:iCs w:val="false"/>
+          <w:color w:val="1F2933"/>
+          <w:sz w:val="21"/>
+          <w:szCs w:val="21"/>
+        </w:rPr>
+        <w:t xml:space="preserve">.</w:t>
+      </w:r>
+    </w:p>
+    <w:p>
+      <w:pPr>
         <w:pStyle w:val="Heading1"/>
         <w:spacing w:after="160" w:before="360"/>
       </w:pPr>
@@ -14205,7 +15900,7 @@
           <w:sz w:val="21"/>
           <w:szCs w:val="21"/>
         </w:rPr>
-        <w:t xml:space="preserve">Năm quyết định đầu có tài liệu riêng trong </w:t>
+        <w:t xml:space="preserve">Mỗi quyết định có một tài liệu riêng trong </w:t>
       </w:r>
       <w:r>
         <w:rPr>
@@ -14227,7 +15922,7 @@
           <w:sz w:val="21"/>
           <w:szCs w:val="21"/>
         </w:rPr>
-        <w:t xml:space="preserve">, kèm phương án đã loại.</w:t>
+        <w:t xml:space="preserve">, kèm phương án đã loại và đánh đổi phải sống chung.</w:t>
       </w:r>
     </w:p>
     <w:tbl>
@@ -14243,9 +15938,9 @@
         </w:tblBorders>
       </w:tblPr>
       <w:tblGrid>
-        <w:gridCol w:w="1673"/>
-        <w:gridCol w:w="3993"/>
-        <w:gridCol w:w="3972"/>
+        <w:gridCol w:w="1890"/>
+        <w:gridCol w:w="3884"/>
+        <w:gridCol w:w="3864"/>
       </w:tblGrid>
       <w:tr>
         <w:trPr>
@@ -14253,7 +15948,7 @@
         </w:trPr>
         <w:tc>
           <w:tcPr>
-            <w:tcW w:type="dxa" w:w="1673"/>
+            <w:tcW w:type="dxa" w:w="1890"/>
             <w:shd w:fill="EAF1EE" w:color="auto" w:val="clear"/>
             <w:tcMar>
               <w:top w:type="dxa" w:w="60"/>
@@ -14283,7 +15978,7 @@
         </w:tc>
         <w:tc>
           <w:tcPr>
-            <w:tcW w:type="dxa" w:w="3993"/>
+            <w:tcW w:type="dxa" w:w="3884"/>
             <w:shd w:fill="EAF1EE" w:color="auto" w:val="clear"/>
             <w:tcMar>
               <w:top w:type="dxa" w:w="60"/>
@@ -14313,7 +16008,7 @@
         </w:tc>
         <w:tc>
           <w:tcPr>
-            <w:tcW w:type="dxa" w:w="3972"/>
+            <w:tcW w:type="dxa" w:w="3864"/>
             <w:shd w:fill="EAF1EE" w:color="auto" w:val="clear"/>
             <w:tcMar>
               <w:top w:type="dxa" w:w="60"/>
@@ -14348,7 +16043,7 @@
         </w:trPr>
         <w:tc>
           <w:tcPr>
-            <w:tcW w:type="dxa" w:w="1673"/>
+            <w:tcW w:type="dxa" w:w="1890"/>
             <w:tcMar>
               <w:top w:type="dxa" w:w="60"/>
               <w:left w:type="dxa" w:w="90"/>
@@ -14377,7 +16072,7 @@
         </w:tc>
         <w:tc>
           <w:tcPr>
-            <w:tcW w:type="dxa" w:w="3993"/>
+            <w:tcW w:type="dxa" w:w="3884"/>
             <w:tcMar>
               <w:top w:type="dxa" w:w="60"/>
               <w:left w:type="dxa" w:w="90"/>
@@ -14406,7 +16101,7 @@
         </w:tc>
         <w:tc>
           <w:tcPr>
-            <w:tcW w:type="dxa" w:w="3972"/>
+            <w:tcW w:type="dxa" w:w="3864"/>
             <w:tcMar>
               <w:top w:type="dxa" w:w="60"/>
               <w:left w:type="dxa" w:w="90"/>
@@ -14440,7 +16135,7 @@
         </w:trPr>
         <w:tc>
           <w:tcPr>
-            <w:tcW w:type="dxa" w:w="1673"/>
+            <w:tcW w:type="dxa" w:w="1890"/>
             <w:tcMar>
               <w:top w:type="dxa" w:w="60"/>
               <w:left w:type="dxa" w:w="90"/>
@@ -14469,7 +16164,7 @@
         </w:tc>
         <w:tc>
           <w:tcPr>
-            <w:tcW w:type="dxa" w:w="3993"/>
+            <w:tcW w:type="dxa" w:w="3884"/>
             <w:tcMar>
               <w:top w:type="dxa" w:w="60"/>
               <w:left w:type="dxa" w:w="90"/>
@@ -14498,7 +16193,7 @@
         </w:tc>
         <w:tc>
           <w:tcPr>
-            <w:tcW w:type="dxa" w:w="3972"/>
+            <w:tcW w:type="dxa" w:w="3864"/>
             <w:tcMar>
               <w:top w:type="dxa" w:w="60"/>
               <w:left w:type="dxa" w:w="90"/>
@@ -14532,7 +16227,7 @@
         </w:trPr>
         <w:tc>
           <w:tcPr>
-            <w:tcW w:type="dxa" w:w="1673"/>
+            <w:tcW w:type="dxa" w:w="1890"/>
             <w:tcMar>
               <w:top w:type="dxa" w:w="60"/>
               <w:left w:type="dxa" w:w="90"/>
@@ -14561,7 +16256,7 @@
         </w:tc>
         <w:tc>
           <w:tcPr>
-            <w:tcW w:type="dxa" w:w="3993"/>
+            <w:tcW w:type="dxa" w:w="3884"/>
             <w:tcMar>
               <w:top w:type="dxa" w:w="60"/>
               <w:left w:type="dxa" w:w="90"/>
@@ -14590,7 +16285,7 @@
         </w:tc>
         <w:tc>
           <w:tcPr>
-            <w:tcW w:type="dxa" w:w="3972"/>
+            <w:tcW w:type="dxa" w:w="3864"/>
             <w:tcMar>
               <w:top w:type="dxa" w:w="60"/>
               <w:left w:type="dxa" w:w="90"/>
@@ -14624,7 +16319,7 @@
         </w:trPr>
         <w:tc>
           <w:tcPr>
-            <w:tcW w:type="dxa" w:w="1673"/>
+            <w:tcW w:type="dxa" w:w="1890"/>
             <w:tcMar>
               <w:top w:type="dxa" w:w="60"/>
               <w:left w:type="dxa" w:w="90"/>
@@ -14653,7 +16348,7 @@
         </w:tc>
         <w:tc>
           <w:tcPr>
-            <w:tcW w:type="dxa" w:w="3993"/>
+            <w:tcW w:type="dxa" w:w="3884"/>
             <w:tcMar>
               <w:top w:type="dxa" w:w="60"/>
               <w:left w:type="dxa" w:w="90"/>
@@ -14682,7 +16377,7 @@
         </w:tc>
         <w:tc>
           <w:tcPr>
-            <w:tcW w:type="dxa" w:w="3972"/>
+            <w:tcW w:type="dxa" w:w="3864"/>
             <w:tcMar>
               <w:top w:type="dxa" w:w="60"/>
               <w:left w:type="dxa" w:w="90"/>
@@ -14716,7 +16411,7 @@
         </w:trPr>
         <w:tc>
           <w:tcPr>
-            <w:tcW w:type="dxa" w:w="1673"/>
+            <w:tcW w:type="dxa" w:w="1890"/>
             <w:tcMar>
               <w:top w:type="dxa" w:w="60"/>
               <w:left w:type="dxa" w:w="90"/>
@@ -14745,7 +16440,7 @@
         </w:tc>
         <w:tc>
           <w:tcPr>
-            <w:tcW w:type="dxa" w:w="3993"/>
+            <w:tcW w:type="dxa" w:w="3884"/>
             <w:tcMar>
               <w:top w:type="dxa" w:w="60"/>
               <w:left w:type="dxa" w:w="90"/>
@@ -14774,7 +16469,7 @@
         </w:tc>
         <w:tc>
           <w:tcPr>
-            <w:tcW w:type="dxa" w:w="3972"/>
+            <w:tcW w:type="dxa" w:w="3864"/>
             <w:tcMar>
               <w:top w:type="dxa" w:w="60"/>
               <w:left w:type="dxa" w:w="90"/>
@@ -14808,36 +16503,36 @@
         </w:trPr>
         <w:tc>
           <w:tcPr>
-            <w:tcW w:type="dxa" w:w="1673"/>
-            <w:tcMar>
-              <w:top w:type="dxa" w:w="60"/>
-              <w:left w:type="dxa" w:w="90"/>
-              <w:bottom w:type="dxa" w:w="60"/>
-              <w:right w:type="dxa" w:w="90"/>
-            </w:tcMar>
-          </w:tcPr>
-          <w:p>
-            <w:pPr>
-              <w:spacing w:after="0" w:line="252"/>
-            </w:pPr>
-            <w:r>
-              <w:rPr>
-                <w:rFonts w:ascii="Calibri" w:cs="Calibri" w:eastAsia="Calibri" w:hAnsi="Calibri"/>
-                <w:b w:val="false"/>
-                <w:bCs w:val="false"/>
-                <w:i w:val="false"/>
-                <w:iCs w:val="false"/>
-                <w:color w:val="1F2933"/>
-                <w:sz w:val="19"/>
-                <w:szCs w:val="19"/>
-              </w:rPr>
-              <w:t xml:space="preserve">—</w:t>
-            </w:r>
-          </w:p>
-        </w:tc>
-        <w:tc>
-          <w:tcPr>
-            <w:tcW w:type="dxa" w:w="3993"/>
+            <w:tcW w:type="dxa" w:w="1890"/>
+            <w:tcMar>
+              <w:top w:type="dxa" w:w="60"/>
+              <w:left w:type="dxa" w:w="90"/>
+              <w:bottom w:type="dxa" w:w="60"/>
+              <w:right w:type="dxa" w:w="90"/>
+            </w:tcMar>
+          </w:tcPr>
+          <w:p>
+            <w:pPr>
+              <w:spacing w:after="0" w:line="252"/>
+            </w:pPr>
+            <w:r>
+              <w:rPr>
+                <w:rFonts w:ascii="Calibri" w:cs="Calibri" w:eastAsia="Calibri" w:hAnsi="Calibri"/>
+                <w:b w:val="false"/>
+                <w:bCs w:val="false"/>
+                <w:i w:val="false"/>
+                <w:iCs w:val="false"/>
+                <w:color w:val="1F2933"/>
+                <w:sz w:val="19"/>
+                <w:szCs w:val="19"/>
+              </w:rPr>
+              <w:t xml:space="preserve">ADR-006</w:t>
+            </w:r>
+          </w:p>
+        </w:tc>
+        <w:tc>
+          <w:tcPr>
+            <w:tcW w:type="dxa" w:w="3884"/>
             <w:tcMar>
               <w:top w:type="dxa" w:w="60"/>
               <w:left w:type="dxa" w:w="90"/>
@@ -14866,7 +16561,7 @@
         </w:tc>
         <w:tc>
           <w:tcPr>
-            <w:tcW w:type="dxa" w:w="3972"/>
+            <w:tcW w:type="dxa" w:w="3864"/>
             <w:tcMar>
               <w:top w:type="dxa" w:w="60"/>
               <w:left w:type="dxa" w:w="90"/>
@@ -14900,36 +16595,36 @@
         </w:trPr>
         <w:tc>
           <w:tcPr>
-            <w:tcW w:type="dxa" w:w="1673"/>
-            <w:tcMar>
-              <w:top w:type="dxa" w:w="60"/>
-              <w:left w:type="dxa" w:w="90"/>
-              <w:bottom w:type="dxa" w:w="60"/>
-              <w:right w:type="dxa" w:w="90"/>
-            </w:tcMar>
-          </w:tcPr>
-          <w:p>
-            <w:pPr>
-              <w:spacing w:after="0" w:line="252"/>
-            </w:pPr>
-            <w:r>
-              <w:rPr>
-                <w:rFonts w:ascii="Calibri" w:cs="Calibri" w:eastAsia="Calibri" w:hAnsi="Calibri"/>
-                <w:b w:val="false"/>
-                <w:bCs w:val="false"/>
-                <w:i w:val="false"/>
-                <w:iCs w:val="false"/>
-                <w:color w:val="1F2933"/>
-                <w:sz w:val="19"/>
-                <w:szCs w:val="19"/>
-              </w:rPr>
-              <w:t xml:space="preserve">—</w:t>
-            </w:r>
-          </w:p>
-        </w:tc>
-        <w:tc>
-          <w:tcPr>
-            <w:tcW w:type="dxa" w:w="3993"/>
+            <w:tcW w:type="dxa" w:w="1890"/>
+            <w:tcMar>
+              <w:top w:type="dxa" w:w="60"/>
+              <w:left w:type="dxa" w:w="90"/>
+              <w:bottom w:type="dxa" w:w="60"/>
+              <w:right w:type="dxa" w:w="90"/>
+            </w:tcMar>
+          </w:tcPr>
+          <w:p>
+            <w:pPr>
+              <w:spacing w:after="0" w:line="252"/>
+            </w:pPr>
+            <w:r>
+              <w:rPr>
+                <w:rFonts w:ascii="Calibri" w:cs="Calibri" w:eastAsia="Calibri" w:hAnsi="Calibri"/>
+                <w:b w:val="false"/>
+                <w:bCs w:val="false"/>
+                <w:i w:val="false"/>
+                <w:iCs w:val="false"/>
+                <w:color w:val="1F2933"/>
+                <w:sz w:val="19"/>
+                <w:szCs w:val="19"/>
+              </w:rPr>
+              <w:t xml:space="preserve">ADR-007</w:t>
+            </w:r>
+          </w:p>
+        </w:tc>
+        <w:tc>
+          <w:tcPr>
+            <w:tcW w:type="dxa" w:w="3884"/>
             <w:tcMar>
               <w:top w:type="dxa" w:w="60"/>
               <w:left w:type="dxa" w:w="90"/>
@@ -14958,7 +16653,7 @@
         </w:tc>
         <w:tc>
           <w:tcPr>
-            <w:tcW w:type="dxa" w:w="3972"/>
+            <w:tcW w:type="dxa" w:w="3864"/>
             <w:tcMar>
               <w:top w:type="dxa" w:w="60"/>
               <w:left w:type="dxa" w:w="90"/>
@@ -14992,36 +16687,36 @@
         </w:trPr>
         <w:tc>
           <w:tcPr>
-            <w:tcW w:type="dxa" w:w="1673"/>
-            <w:tcMar>
-              <w:top w:type="dxa" w:w="60"/>
-              <w:left w:type="dxa" w:w="90"/>
-              <w:bottom w:type="dxa" w:w="60"/>
-              <w:right w:type="dxa" w:w="90"/>
-            </w:tcMar>
-          </w:tcPr>
-          <w:p>
-            <w:pPr>
-              <w:spacing w:after="0" w:line="252"/>
-            </w:pPr>
-            <w:r>
-              <w:rPr>
-                <w:rFonts w:ascii="Calibri" w:cs="Calibri" w:eastAsia="Calibri" w:hAnsi="Calibri"/>
-                <w:b w:val="false"/>
-                <w:bCs w:val="false"/>
-                <w:i w:val="false"/>
-                <w:iCs w:val="false"/>
-                <w:color w:val="1F2933"/>
-                <w:sz w:val="19"/>
-                <w:szCs w:val="19"/>
-              </w:rPr>
-              <w:t xml:space="preserve">—</w:t>
-            </w:r>
-          </w:p>
-        </w:tc>
-        <w:tc>
-          <w:tcPr>
-            <w:tcW w:type="dxa" w:w="3993"/>
+            <w:tcW w:type="dxa" w:w="1890"/>
+            <w:tcMar>
+              <w:top w:type="dxa" w:w="60"/>
+              <w:left w:type="dxa" w:w="90"/>
+              <w:bottom w:type="dxa" w:w="60"/>
+              <w:right w:type="dxa" w:w="90"/>
+            </w:tcMar>
+          </w:tcPr>
+          <w:p>
+            <w:pPr>
+              <w:spacing w:after="0" w:line="252"/>
+            </w:pPr>
+            <w:r>
+              <w:rPr>
+                <w:rFonts w:ascii="Calibri" w:cs="Calibri" w:eastAsia="Calibri" w:hAnsi="Calibri"/>
+                <w:b w:val="false"/>
+                <w:bCs w:val="false"/>
+                <w:i w:val="false"/>
+                <w:iCs w:val="false"/>
+                <w:color w:val="1F2933"/>
+                <w:sz w:val="19"/>
+                <w:szCs w:val="19"/>
+              </w:rPr>
+              <w:t xml:space="preserve">ADR-008</w:t>
+            </w:r>
+          </w:p>
+        </w:tc>
+        <w:tc>
+          <w:tcPr>
+            <w:tcW w:type="dxa" w:w="3884"/>
             <w:tcMar>
               <w:top w:type="dxa" w:w="60"/>
               <w:left w:type="dxa" w:w="90"/>
@@ -15050,7 +16745,7 @@
         </w:tc>
         <w:tc>
           <w:tcPr>
-            <w:tcW w:type="dxa" w:w="3972"/>
+            <w:tcW w:type="dxa" w:w="3864"/>
             <w:tcMar>
               <w:top w:type="dxa" w:w="60"/>
               <w:left w:type="dxa" w:w="90"/>
@@ -15084,36 +16779,36 @@
         </w:trPr>
         <w:tc>
           <w:tcPr>
-            <w:tcW w:type="dxa" w:w="1673"/>
-            <w:tcMar>
-              <w:top w:type="dxa" w:w="60"/>
-              <w:left w:type="dxa" w:w="90"/>
-              <w:bottom w:type="dxa" w:w="60"/>
-              <w:right w:type="dxa" w:w="90"/>
-            </w:tcMar>
-          </w:tcPr>
-          <w:p>
-            <w:pPr>
-              <w:spacing w:after="0" w:line="252"/>
-            </w:pPr>
-            <w:r>
-              <w:rPr>
-                <w:rFonts w:ascii="Calibri" w:cs="Calibri" w:eastAsia="Calibri" w:hAnsi="Calibri"/>
-                <w:b w:val="false"/>
-                <w:bCs w:val="false"/>
-                <w:i w:val="false"/>
-                <w:iCs w:val="false"/>
-                <w:color w:val="1F2933"/>
-                <w:sz w:val="19"/>
-                <w:szCs w:val="19"/>
-              </w:rPr>
-              <w:t xml:space="preserve">—</w:t>
-            </w:r>
-          </w:p>
-        </w:tc>
-        <w:tc>
-          <w:tcPr>
-            <w:tcW w:type="dxa" w:w="3993"/>
+            <w:tcW w:type="dxa" w:w="1890"/>
+            <w:tcMar>
+              <w:top w:type="dxa" w:w="60"/>
+              <w:left w:type="dxa" w:w="90"/>
+              <w:bottom w:type="dxa" w:w="60"/>
+              <w:right w:type="dxa" w:w="90"/>
+            </w:tcMar>
+          </w:tcPr>
+          <w:p>
+            <w:pPr>
+              <w:spacing w:after="0" w:line="252"/>
+            </w:pPr>
+            <w:r>
+              <w:rPr>
+                <w:rFonts w:ascii="Calibri" w:cs="Calibri" w:eastAsia="Calibri" w:hAnsi="Calibri"/>
+                <w:b w:val="false"/>
+                <w:bCs w:val="false"/>
+                <w:i w:val="false"/>
+                <w:iCs w:val="false"/>
+                <w:color w:val="1F2933"/>
+                <w:sz w:val="19"/>
+                <w:szCs w:val="19"/>
+              </w:rPr>
+              <w:t xml:space="preserve">ADR-009</w:t>
+            </w:r>
+          </w:p>
+        </w:tc>
+        <w:tc>
+          <w:tcPr>
+            <w:tcW w:type="dxa" w:w="3884"/>
             <w:tcMar>
               <w:top w:type="dxa" w:w="60"/>
               <w:left w:type="dxa" w:w="90"/>
@@ -15142,7 +16837,7 @@
         </w:tc>
         <w:tc>
           <w:tcPr>
-            <w:tcW w:type="dxa" w:w="3972"/>
+            <w:tcW w:type="dxa" w:w="3864"/>
             <w:tcMar>
               <w:top w:type="dxa" w:w="60"/>
               <w:left w:type="dxa" w:w="90"/>
@@ -15176,36 +16871,36 @@
         </w:trPr>
         <w:tc>
           <w:tcPr>
-            <w:tcW w:type="dxa" w:w="1673"/>
-            <w:tcMar>
-              <w:top w:type="dxa" w:w="60"/>
-              <w:left w:type="dxa" w:w="90"/>
-              <w:bottom w:type="dxa" w:w="60"/>
-              <w:right w:type="dxa" w:w="90"/>
-            </w:tcMar>
-          </w:tcPr>
-          <w:p>
-            <w:pPr>
-              <w:spacing w:after="0" w:line="252"/>
-            </w:pPr>
-            <w:r>
-              <w:rPr>
-                <w:rFonts w:ascii="Calibri" w:cs="Calibri" w:eastAsia="Calibri" w:hAnsi="Calibri"/>
-                <w:b w:val="false"/>
-                <w:bCs w:val="false"/>
-                <w:i w:val="false"/>
-                <w:iCs w:val="false"/>
-                <w:color w:val="1F2933"/>
-                <w:sz w:val="19"/>
-                <w:szCs w:val="19"/>
-              </w:rPr>
-              <w:t xml:space="preserve">—</w:t>
-            </w:r>
-          </w:p>
-        </w:tc>
-        <w:tc>
-          <w:tcPr>
-            <w:tcW w:type="dxa" w:w="3993"/>
+            <w:tcW w:type="dxa" w:w="1890"/>
+            <w:tcMar>
+              <w:top w:type="dxa" w:w="60"/>
+              <w:left w:type="dxa" w:w="90"/>
+              <w:bottom w:type="dxa" w:w="60"/>
+              <w:right w:type="dxa" w:w="90"/>
+            </w:tcMar>
+          </w:tcPr>
+          <w:p>
+            <w:pPr>
+              <w:spacing w:after="0" w:line="252"/>
+            </w:pPr>
+            <w:r>
+              <w:rPr>
+                <w:rFonts w:ascii="Calibri" w:cs="Calibri" w:eastAsia="Calibri" w:hAnsi="Calibri"/>
+                <w:b w:val="false"/>
+                <w:bCs w:val="false"/>
+                <w:i w:val="false"/>
+                <w:iCs w:val="false"/>
+                <w:color w:val="1F2933"/>
+                <w:sz w:val="19"/>
+                <w:szCs w:val="19"/>
+              </w:rPr>
+              <w:t xml:space="preserve">ADR-010</w:t>
+            </w:r>
+          </w:p>
+        </w:tc>
+        <w:tc>
+          <w:tcPr>
+            <w:tcW w:type="dxa" w:w="3884"/>
             <w:tcMar>
               <w:top w:type="dxa" w:w="60"/>
               <w:left w:type="dxa" w:w="90"/>
@@ -15234,7 +16929,7 @@
         </w:tc>
         <w:tc>
           <w:tcPr>
-            <w:tcW w:type="dxa" w:w="3972"/>
+            <w:tcW w:type="dxa" w:w="3864"/>
             <w:tcMar>
               <w:top w:type="dxa" w:w="60"/>
               <w:left w:type="dxa" w:w="90"/>
@@ -16324,9 +18019,9 @@
         </w:tblBorders>
       </w:tblPr>
       <w:tblGrid>
-        <w:gridCol w:w="1894"/>
-        <w:gridCol w:w="3922"/>
-        <w:gridCol w:w="3822"/>
+        <w:gridCol w:w="1759"/>
+        <w:gridCol w:w="4017"/>
+        <w:gridCol w:w="3862"/>
       </w:tblGrid>
       <w:tr>
         <w:trPr>
@@ -16334,7 +18029,7 @@
         </w:trPr>
         <w:tc>
           <w:tcPr>
-            <w:tcW w:type="dxa" w:w="1894"/>
+            <w:tcW w:type="dxa" w:w="1759"/>
             <w:shd w:fill="EAF1EE" w:color="auto" w:val="clear"/>
             <w:tcMar>
               <w:top w:type="dxa" w:w="60"/>
@@ -16364,7 +18059,7 @@
         </w:tc>
         <w:tc>
           <w:tcPr>
-            <w:tcW w:type="dxa" w:w="3922"/>
+            <w:tcW w:type="dxa" w:w="4017"/>
             <w:shd w:fill="EAF1EE" w:color="auto" w:val="clear"/>
             <w:tcMar>
               <w:top w:type="dxa" w:w="60"/>
@@ -16394,7 +18089,7 @@
         </w:tc>
         <w:tc>
           <w:tcPr>
-            <w:tcW w:type="dxa" w:w="3822"/>
+            <w:tcW w:type="dxa" w:w="3862"/>
             <w:shd w:fill="EAF1EE" w:color="auto" w:val="clear"/>
             <w:tcMar>
               <w:top w:type="dxa" w:w="60"/>
@@ -16429,7 +18124,7 @@
         </w:trPr>
         <w:tc>
           <w:tcPr>
-            <w:tcW w:type="dxa" w:w="1894"/>
+            <w:tcW w:type="dxa" w:w="1759"/>
             <w:tcMar>
               <w:top w:type="dxa" w:w="60"/>
               <w:left w:type="dxa" w:w="90"/>
@@ -16458,7 +18153,7 @@
         </w:tc>
         <w:tc>
           <w:tcPr>
-            <w:tcW w:type="dxa" w:w="3922"/>
+            <w:tcW w:type="dxa" w:w="4017"/>
             <w:tcMar>
               <w:top w:type="dxa" w:w="60"/>
               <w:left w:type="dxa" w:w="90"/>
@@ -16487,7 +18182,7 @@
         </w:tc>
         <w:tc>
           <w:tcPr>
-            <w:tcW w:type="dxa" w:w="3822"/>
+            <w:tcW w:type="dxa" w:w="3862"/>
             <w:tcMar>
               <w:top w:type="dxa" w:w="60"/>
               <w:left w:type="dxa" w:w="90"/>
@@ -16521,7 +18216,7 @@
         </w:trPr>
         <w:tc>
           <w:tcPr>
-            <w:tcW w:type="dxa" w:w="1894"/>
+            <w:tcW w:type="dxa" w:w="1759"/>
             <w:tcMar>
               <w:top w:type="dxa" w:w="60"/>
               <w:left w:type="dxa" w:w="90"/>
@@ -16550,59 +18245,94 @@
         </w:tc>
         <w:tc>
           <w:tcPr>
-            <w:tcW w:type="dxa" w:w="3922"/>
-            <w:tcMar>
-              <w:top w:type="dxa" w:w="60"/>
-              <w:left w:type="dxa" w:w="90"/>
-              <w:bottom w:type="dxa" w:w="60"/>
-              <w:right w:type="dxa" w:w="90"/>
-            </w:tcMar>
-          </w:tcPr>
-          <w:p>
-            <w:pPr>
-              <w:spacing w:after="0" w:line="252"/>
-            </w:pPr>
-            <w:r>
-              <w:rPr>
-                <w:rFonts w:ascii="Calibri" w:cs="Calibri" w:eastAsia="Calibri" w:hAnsi="Calibri"/>
-                <w:b w:val="false"/>
-                <w:bCs w:val="false"/>
-                <w:i w:val="false"/>
-                <w:iCs w:val="false"/>
-                <w:color w:val="1F2933"/>
-                <w:sz w:val="19"/>
-                <w:szCs w:val="19"/>
-              </w:rPr>
-              <w:t xml:space="preserve">Bộ mã vật tư, công trình, nhà cung cấp</w:t>
-            </w:r>
-          </w:p>
-        </w:tc>
-        <w:tc>
-          <w:tcPr>
-            <w:tcW w:type="dxa" w:w="3822"/>
-            <w:tcMar>
-              <w:top w:type="dxa" w:w="60"/>
-              <w:left w:type="dxa" w:w="90"/>
-              <w:bottom w:type="dxa" w:w="60"/>
-              <w:right w:type="dxa" w:w="90"/>
-            </w:tcMar>
-          </w:tcPr>
-          <w:p>
-            <w:pPr>
-              <w:spacing w:after="0" w:line="252"/>
-            </w:pPr>
-            <w:r>
-              <w:rPr>
-                <w:rFonts w:ascii="Calibri" w:cs="Calibri" w:eastAsia="Calibri" w:hAnsi="Calibri"/>
-                <w:b w:val="false"/>
-                <w:bCs w:val="false"/>
-                <w:i w:val="false"/>
-                <w:iCs w:val="false"/>
-                <w:color w:val="1F2933"/>
-                <w:sz w:val="19"/>
-                <w:szCs w:val="19"/>
-              </w:rPr>
-              <w:t xml:space="preserve">Nhập liệu thật</w:t>
+            <w:tcW w:type="dxa" w:w="4017"/>
+            <w:tcMar>
+              <w:top w:type="dxa" w:w="60"/>
+              <w:left w:type="dxa" w:w="90"/>
+              <w:bottom w:type="dxa" w:w="60"/>
+              <w:right w:type="dxa" w:w="90"/>
+            </w:tcMar>
+          </w:tcPr>
+          <w:p>
+            <w:pPr>
+              <w:spacing w:after="0" w:line="252"/>
+            </w:pPr>
+            <w:r>
+              <w:rPr>
+                <w:rFonts w:ascii="Calibri" w:cs="Calibri" w:eastAsia="Calibri" w:hAnsi="Calibri"/>
+                <w:b w:val="false"/>
+                <w:bCs w:val="false"/>
+                <w:i w:val="false"/>
+                <w:iCs w:val="false"/>
+                <w:color w:val="1F2933"/>
+                <w:sz w:val="19"/>
+                <w:szCs w:val="19"/>
+              </w:rPr>
+              <w:t xml:space="preserve">~~Bộ mã vật tư, công trình, nhà cung cấp~~ — </w:t>
+            </w:r>
+            <w:r>
+              <w:rPr>
+                <w:rFonts w:ascii="Calibri" w:cs="Calibri" w:eastAsia="Calibri" w:hAnsi="Calibri"/>
+                <w:b/>
+                <w:bCs/>
+                <w:i w:val="false"/>
+                <w:iCs w:val="false"/>
+                <w:color w:val="1F2933"/>
+                <w:sz w:val="19"/>
+                <w:szCs w:val="19"/>
+              </w:rPr>
+              <w:t xml:space="preserve">đã chốt 30/09/2026</w:t>
+            </w:r>
+            <w:r>
+              <w:rPr>
+                <w:rFonts w:ascii="Calibri" w:cs="Calibri" w:eastAsia="Calibri" w:hAnsi="Calibri"/>
+                <w:b w:val="false"/>
+                <w:bCs w:val="false"/>
+                <w:i w:val="false"/>
+                <w:iCs w:val="false"/>
+                <w:color w:val="1F2933"/>
+                <w:sz w:val="19"/>
+                <w:szCs w:val="19"/>
+              </w:rPr>
+              <w:t xml:space="preserve">, xem </w:t>
+            </w:r>
+            <w:r>
+              <w:rPr>
+                <w:rFonts w:ascii="Consolas" w:cs="Consolas" w:eastAsia="Consolas" w:hAnsi="Consolas"/>
+                <w:color w:val="1F2933"/>
+                <w:sz w:val="17"/>
+                <w:szCs w:val="17"/>
+              </w:rPr>
+              <w:t xml:space="preserve">doc/BO_MA.md</w:t>
+            </w:r>
+          </w:p>
+        </w:tc>
+        <w:tc>
+          <w:tcPr>
+            <w:tcW w:type="dxa" w:w="3862"/>
+            <w:tcMar>
+              <w:top w:type="dxa" w:w="60"/>
+              <w:left w:type="dxa" w:w="90"/>
+              <w:bottom w:type="dxa" w:w="60"/>
+              <w:right w:type="dxa" w:w="90"/>
+            </w:tcMar>
+          </w:tcPr>
+          <w:p>
+            <w:pPr>
+              <w:spacing w:after="0" w:line="252"/>
+            </w:pPr>
+            <w:r>
+              <w:rPr>
+                <w:rFonts w:ascii="Calibri" w:cs="Calibri" w:eastAsia="Calibri" w:hAnsi="Calibri"/>
+                <w:b w:val="false"/>
+                <w:bCs w:val="false"/>
+                <w:i w:val="false"/>
+                <w:iCs w:val="false"/>
+                <w:color w:val="1F2933"/>
+                <w:sz w:val="19"/>
+                <w:szCs w:val="19"/>
+              </w:rPr>
+              <w:t xml:space="preserve">Không còn chặn</w:t>
             </w:r>
           </w:p>
         </w:tc>
@@ -16613,7 +18343,7 @@
         </w:trPr>
         <w:tc>
           <w:tcPr>
-            <w:tcW w:type="dxa" w:w="1894"/>
+            <w:tcW w:type="dxa" w:w="1759"/>
             <w:tcMar>
               <w:top w:type="dxa" w:w="60"/>
               <w:left w:type="dxa" w:w="90"/>
@@ -16642,7 +18372,7 @@
         </w:tc>
         <w:tc>
           <w:tcPr>
-            <w:tcW w:type="dxa" w:w="3922"/>
+            <w:tcW w:type="dxa" w:w="4017"/>
             <w:tcMar>
               <w:top w:type="dxa" w:w="60"/>
               <w:left w:type="dxa" w:w="90"/>
@@ -16671,7 +18401,7 @@
         </w:tc>
         <w:tc>
           <w:tcPr>
-            <w:tcW w:type="dxa" w:w="3822"/>
+            <w:tcW w:type="dxa" w:w="3862"/>
             <w:tcMar>
               <w:top w:type="dxa" w:w="60"/>
               <w:left w:type="dxa" w:w="90"/>
@@ -16705,7 +18435,7 @@
         </w:trPr>
         <w:tc>
           <w:tcPr>
-            <w:tcW w:type="dxa" w:w="1894"/>
+            <w:tcW w:type="dxa" w:w="1759"/>
             <w:tcMar>
               <w:top w:type="dxa" w:w="60"/>
               <w:left w:type="dxa" w:w="90"/>
@@ -16734,7 +18464,7 @@
         </w:tc>
         <w:tc>
           <w:tcPr>
-            <w:tcW w:type="dxa" w:w="3922"/>
+            <w:tcW w:type="dxa" w:w="4017"/>
             <w:tcMar>
               <w:top w:type="dxa" w:w="60"/>
               <w:left w:type="dxa" w:w="90"/>
@@ -16763,7 +18493,7 @@
         </w:tc>
         <w:tc>
           <w:tcPr>
-            <w:tcW w:type="dxa" w:w="3822"/>
+            <w:tcW w:type="dxa" w:w="3862"/>
             <w:tcMar>
               <w:top w:type="dxa" w:w="60"/>
               <w:left w:type="dxa" w:w="90"/>
@@ -16797,7 +18527,7 @@
         </w:trPr>
         <w:tc>
           <w:tcPr>
-            <w:tcW w:type="dxa" w:w="1894"/>
+            <w:tcW w:type="dxa" w:w="1759"/>
             <w:tcMar>
               <w:top w:type="dxa" w:w="60"/>
               <w:left w:type="dxa" w:w="90"/>
@@ -16826,7 +18556,7 @@
         </w:tc>
         <w:tc>
           <w:tcPr>
-            <w:tcW w:type="dxa" w:w="3922"/>
+            <w:tcW w:type="dxa" w:w="4017"/>
             <w:tcMar>
               <w:top w:type="dxa" w:w="60"/>
               <w:left w:type="dxa" w:w="90"/>
@@ -16855,7 +18585,7 @@
         </w:tc>
         <w:tc>
           <w:tcPr>
-            <w:tcW w:type="dxa" w:w="3822"/>
+            <w:tcW w:type="dxa" w:w="3862"/>
             <w:tcMar>
               <w:top w:type="dxa" w:w="60"/>
               <w:left w:type="dxa" w:w="90"/>
@@ -16889,7 +18619,7 @@
         </w:trPr>
         <w:tc>
           <w:tcPr>
-            <w:tcW w:type="dxa" w:w="1894"/>
+            <w:tcW w:type="dxa" w:w="1759"/>
             <w:tcMar>
               <w:top w:type="dxa" w:w="60"/>
               <w:left w:type="dxa" w:w="90"/>
@@ -16918,7 +18648,7 @@
         </w:tc>
         <w:tc>
           <w:tcPr>
-            <w:tcW w:type="dxa" w:w="3922"/>
+            <w:tcW w:type="dxa" w:w="4017"/>
             <w:tcMar>
               <w:top w:type="dxa" w:w="60"/>
               <w:left w:type="dxa" w:w="90"/>
@@ -16947,7 +18677,7 @@
         </w:tc>
         <w:tc>
           <w:tcPr>
-            <w:tcW w:type="dxa" w:w="3822"/>
+            <w:tcW w:type="dxa" w:w="3862"/>
             <w:tcMar>
               <w:top w:type="dxa" w:w="60"/>
               <w:left w:type="dxa" w:w="90"/>
@@ -16981,7 +18711,7 @@
         </w:trPr>
         <w:tc>
           <w:tcPr>
-            <w:tcW w:type="dxa" w:w="1894"/>
+            <w:tcW w:type="dxa" w:w="1759"/>
             <w:tcMar>
               <w:top w:type="dxa" w:w="60"/>
               <w:left w:type="dxa" w:w="90"/>
@@ -17010,7 +18740,7 @@
         </w:tc>
         <w:tc>
           <w:tcPr>
-            <w:tcW w:type="dxa" w:w="3922"/>
+            <w:tcW w:type="dxa" w:w="4017"/>
             <w:tcMar>
               <w:top w:type="dxa" w:w="60"/>
               <w:left w:type="dxa" w:w="90"/>
@@ -17039,7 +18769,7 @@
         </w:tc>
         <w:tc>
           <w:tcPr>
-            <w:tcW w:type="dxa" w:w="3822"/>
+            <w:tcW w:type="dxa" w:w="3862"/>
             <w:tcMar>
               <w:top w:type="dxa" w:w="60"/>
               <w:left w:type="dxa" w:w="90"/>
@@ -17073,7 +18803,7 @@
         </w:trPr>
         <w:tc>
           <w:tcPr>
-            <w:tcW w:type="dxa" w:w="1894"/>
+            <w:tcW w:type="dxa" w:w="1759"/>
             <w:tcMar>
               <w:top w:type="dxa" w:w="60"/>
               <w:left w:type="dxa" w:w="90"/>
@@ -17102,7 +18832,7 @@
         </w:tc>
         <w:tc>
           <w:tcPr>
-            <w:tcW w:type="dxa" w:w="3922"/>
+            <w:tcW w:type="dxa" w:w="4017"/>
             <w:tcMar>
               <w:top w:type="dxa" w:w="60"/>
               <w:left w:type="dxa" w:w="90"/>
@@ -17131,7 +18861,7 @@
         </w:tc>
         <w:tc>
           <w:tcPr>
-            <w:tcW w:type="dxa" w:w="3822"/>
+            <w:tcW w:type="dxa" w:w="3862"/>
             <w:tcMar>
               <w:top w:type="dxa" w:w="60"/>
               <w:left w:type="dxa" w:w="90"/>
@@ -17165,7 +18895,7 @@
         </w:trPr>
         <w:tc>
           <w:tcPr>
-            <w:tcW w:type="dxa" w:w="1894"/>
+            <w:tcW w:type="dxa" w:w="1759"/>
             <w:tcMar>
               <w:top w:type="dxa" w:w="60"/>
               <w:left w:type="dxa" w:w="90"/>
@@ -17194,7 +18924,7 @@
         </w:tc>
         <w:tc>
           <w:tcPr>
-            <w:tcW w:type="dxa" w:w="3922"/>
+            <w:tcW w:type="dxa" w:w="4017"/>
             <w:tcMar>
               <w:top w:type="dxa" w:w="60"/>
               <w:left w:type="dxa" w:w="90"/>
@@ -17223,7 +18953,7 @@
         </w:tc>
         <w:tc>
           <w:tcPr>
-            <w:tcW w:type="dxa" w:w="3822"/>
+            <w:tcW w:type="dxa" w:w="3862"/>
             <w:tcMar>
               <w:top w:type="dxa" w:w="60"/>
               <w:left w:type="dxa" w:w="90"/>
@@ -17247,6 +18977,190 @@
                 <w:szCs w:val="19"/>
               </w:rPr>
               <w:t xml:space="preserve">Số hoá hồ sơ cũ trên bản vận hành, không qua máy trạm</w:t>
+            </w:r>
+          </w:p>
+        </w:tc>
+      </w:tr>
+      <w:tr>
+        <w:trPr>
+          <w:cantSplit/>
+        </w:trPr>
+        <w:tc>
+          <w:tcPr>
+            <w:tcW w:type="dxa" w:w="1759"/>
+            <w:tcMar>
+              <w:top w:type="dxa" w:w="60"/>
+              <w:left w:type="dxa" w:w="90"/>
+              <w:bottom w:type="dxa" w:w="60"/>
+              <w:right w:type="dxa" w:w="90"/>
+            </w:tcMar>
+          </w:tcPr>
+          <w:p>
+            <w:pPr>
+              <w:spacing w:after="0" w:line="252"/>
+            </w:pPr>
+            <w:r>
+              <w:rPr>
+                <w:rFonts w:ascii="Calibri" w:cs="Calibri" w:eastAsia="Calibri" w:hAnsi="Calibri"/>
+                <w:b w:val="false"/>
+                <w:bCs w:val="false"/>
+                <w:i w:val="false"/>
+                <w:iCs w:val="false"/>
+                <w:color w:val="1F2933"/>
+                <w:sz w:val="19"/>
+                <w:szCs w:val="19"/>
+              </w:rPr>
+              <w:t xml:space="preserve">TBD-10</w:t>
+            </w:r>
+          </w:p>
+        </w:tc>
+        <w:tc>
+          <w:tcPr>
+            <w:tcW w:type="dxa" w:w="4017"/>
+            <w:tcMar>
+              <w:top w:type="dxa" w:w="60"/>
+              <w:left w:type="dxa" w:w="90"/>
+              <w:bottom w:type="dxa" w:w="60"/>
+              <w:right w:type="dxa" w:w="90"/>
+            </w:tcMar>
+          </w:tcPr>
+          <w:p>
+            <w:pPr>
+              <w:spacing w:after="0" w:line="252"/>
+            </w:pPr>
+            <w:r>
+              <w:rPr>
+                <w:rFonts w:ascii="Calibri" w:cs="Calibri" w:eastAsia="Calibri" w:hAnsi="Calibri"/>
+                <w:b w:val="false"/>
+                <w:bCs w:val="false"/>
+                <w:i w:val="false"/>
+                <w:iCs w:val="false"/>
+                <w:color w:val="1F2933"/>
+                <w:sz w:val="19"/>
+                <w:szCs w:val="19"/>
+              </w:rPr>
+              <w:t xml:space="preserve">Mức trần chi tiêu AI mỗi tháng cho từng pháp nhân, và ngưỡng cảnh báo trước đó</w:t>
+            </w:r>
+          </w:p>
+        </w:tc>
+        <w:tc>
+          <w:tcPr>
+            <w:tcW w:type="dxa" w:w="3862"/>
+            <w:tcMar>
+              <w:top w:type="dxa" w:w="60"/>
+              <w:left w:type="dxa" w:w="90"/>
+              <w:bottom w:type="dxa" w:w="60"/>
+              <w:right w:type="dxa" w:w="90"/>
+            </w:tcMar>
+          </w:tcPr>
+          <w:p>
+            <w:pPr>
+              <w:spacing w:after="0" w:line="252"/>
+            </w:pPr>
+            <w:r>
+              <w:rPr>
+                <w:rFonts w:ascii="Calibri" w:cs="Calibri" w:eastAsia="Calibri" w:hAnsi="Calibri"/>
+                <w:b w:val="false"/>
+                <w:bCs w:val="false"/>
+                <w:i w:val="false"/>
+                <w:iCs w:val="false"/>
+                <w:color w:val="1F2933"/>
+                <w:sz w:val="19"/>
+                <w:szCs w:val="19"/>
+              </w:rPr>
+              <w:t xml:space="preserve">Bật ngắt mạch chi phí; cố ý để rỗng trong lúc phát triển và chạy thử</w:t>
+            </w:r>
+          </w:p>
+        </w:tc>
+      </w:tr>
+      <w:tr>
+        <w:trPr>
+          <w:cantSplit/>
+        </w:trPr>
+        <w:tc>
+          <w:tcPr>
+            <w:tcW w:type="dxa" w:w="1759"/>
+            <w:tcMar>
+              <w:top w:type="dxa" w:w="60"/>
+              <w:left w:type="dxa" w:w="90"/>
+              <w:bottom w:type="dxa" w:w="60"/>
+              <w:right w:type="dxa" w:w="90"/>
+            </w:tcMar>
+          </w:tcPr>
+          <w:p>
+            <w:pPr>
+              <w:spacing w:after="0" w:line="252"/>
+            </w:pPr>
+            <w:r>
+              <w:rPr>
+                <w:rFonts w:ascii="Calibri" w:cs="Calibri" w:eastAsia="Calibri" w:hAnsi="Calibri"/>
+                <w:b w:val="false"/>
+                <w:bCs w:val="false"/>
+                <w:i w:val="false"/>
+                <w:iCs w:val="false"/>
+                <w:color w:val="1F2933"/>
+                <w:sz w:val="19"/>
+                <w:szCs w:val="19"/>
+              </w:rPr>
+              <w:t xml:space="preserve">TBD-11</w:t>
+            </w:r>
+          </w:p>
+        </w:tc>
+        <w:tc>
+          <w:tcPr>
+            <w:tcW w:type="dxa" w:w="4017"/>
+            <w:tcMar>
+              <w:top w:type="dxa" w:w="60"/>
+              <w:left w:type="dxa" w:w="90"/>
+              <w:bottom w:type="dxa" w:w="60"/>
+              <w:right w:type="dxa" w:w="90"/>
+            </w:tcMar>
+          </w:tcPr>
+          <w:p>
+            <w:pPr>
+              <w:spacing w:after="0" w:line="252"/>
+            </w:pPr>
+            <w:r>
+              <w:rPr>
+                <w:rFonts w:ascii="Calibri" w:cs="Calibri" w:eastAsia="Calibri" w:hAnsi="Calibri"/>
+                <w:b w:val="false"/>
+                <w:bCs w:val="false"/>
+                <w:i w:val="false"/>
+                <w:iCs w:val="false"/>
+                <w:color w:val="1F2933"/>
+                <w:sz w:val="19"/>
+                <w:szCs w:val="19"/>
+              </w:rPr>
+              <w:t xml:space="preserve">Nâng gói nền dữ liệu có sao lưu, tạo môi trường vận hành</w:t>
+            </w:r>
+          </w:p>
+        </w:tc>
+        <w:tc>
+          <w:tcPr>
+            <w:tcW w:type="dxa" w:w="3862"/>
+            <w:tcMar>
+              <w:top w:type="dxa" w:w="60"/>
+              <w:left w:type="dxa" w:w="90"/>
+              <w:bottom w:type="dxa" w:w="60"/>
+              <w:right w:type="dxa" w:w="90"/>
+            </w:tcMar>
+          </w:tcPr>
+          <w:p>
+            <w:pPr>
+              <w:spacing w:after="0" w:line="252"/>
+            </w:pPr>
+            <w:r>
+              <w:rPr>
+                <w:rFonts w:ascii="Calibri" w:cs="Calibri" w:eastAsia="Calibri" w:hAnsi="Calibri"/>
+                <w:b w:val="false"/>
+                <w:bCs w:val="false"/>
+                <w:i w:val="false"/>
+                <w:iCs w:val="false"/>
+                <w:color w:val="1F2933"/>
+                <w:sz w:val="19"/>
+                <w:szCs w:val="19"/>
+              </w:rPr>
+              <w:t xml:space="preserve">Nhập dòng dữ liệu thật đầu tiên — gói miễn phí không sao lưu và tự dừng khi không dùng</w:t>
             </w:r>
           </w:p>
         </w:tc>
@@ -20064,6 +21978,12 @@
     </w:lvlOverride>
   </w:num>
   <w:num w:numId="3">
+    <w:abstractNumId w:val="3"/>
+    <w:lvlOverride w:ilvl="0">
+      <w:startOverride w:val="1"/>
+    </w:lvlOverride>
+  </w:num>
+  <w:num w:numId="4">
     <w:abstractNumId w:val="3"/>
     <w:lvlOverride w:ilvl="0">
       <w:startOverride w:val="1"/>

</xml_diff>